<commit_message>
format(ctu): CTU-standard chapters + CĐ — thesis docx template + per-chapter PDFs
The per-chapter bundle docx had been generated with ctu_paper_reference.docx
(2.5cm uniform margins), not the CTU dissertation spec. Corrected to the
CTU standard (QĐ 1799/SH: TeX Gyre Termes 13pt, left 3cm / right-top-bottom 2cm,
line spacing 1.2):

- Regenerated all dissertation docx (5 chapters + front matter + references +
  appendices A/B) and both CĐ docx with templates/ctu_thesis_reference.docx
  (verified pgMar left=1701/others=1134 twips = 3cm/2cm).
- Built standalone CTU PDFs per chapter via XeLaTeX (ch.1 9pp, ch.2 23pp,
  ch.3 24pp, ch.4 39pp, ch.5 20pp), added alongside each chapter docx.
- CĐ PDFs already compiled in CTU format. README updated to note the standard.

Co-Authored-By: Claude Opus 4.8 (1M context) <noreply@anthropic.com>
Claude-Session: https://claude.ai/code/session_01Xumaoraa2DLWLXsgJJ62oq
</commit_message>
<xml_diff>
--- a/dist/BO_NOP_HOAN_CHINH_2026-06/2_chuyen_de/CD1_CTU.docx
+++ b/dist/BO_NOP_HOAN_CHINH_2026-06/2_chuyen_de/CD1_CTU.docx
@@ -23282,7 +23282,7 @@
     <w:bookmarkEnd w:id="112"/>
     <w:sectPr>
       <w:pgSz w:h="16838" w:w="11906"/>
-      <w:pgMar w:bottom="1417" w:left="1417" w:right="1417" w:top="1417"/>
+      <w:pgMar w:bottom="1134" w:left="1701" w:right="1134" w:top="1134"/>
     </w:sectPr>
   </w:body>
 </w:document>
@@ -23956,13 +23956,13 @@
     <w:name w:val="Normal"/>
     <w:qFormat/>
     <w:pPr>
-      <w:spacing w:line="276" w:lineRule="auto"/>
+      <w:spacing w:line="288" w:lineRule="auto"/>
       <w:jc w:val="both"/>
     </w:pPr>
     <w:rPr>
       <w:rFonts w:ascii="Times New Roman" w:eastAsia="Times New Roman" w:hAnsi="Times New Roman"/>
       <w:color w:val="000000"/>
-      <w:sz w:val="24"/>
+      <w:sz w:val="26"/>
     </w:rPr>
   </w:style>
   <w:style w:styleId="BodyText" w:type="paragraph">
@@ -23970,14 +23970,14 @@
     <w:basedOn w:val="Normal"/>
     <w:link w:val="BodyTextChar"/>
     <w:pPr>
-      <w:spacing w:after="180" w:before="180" w:line="276" w:lineRule="auto"/>
+      <w:spacing w:after="180" w:before="180" w:line="288" w:lineRule="auto"/>
       <w:jc w:val="both"/>
     </w:pPr>
     <w:qFormat/>
     <w:rPr>
       <w:rFonts w:ascii="Times New Roman" w:eastAsia="Times New Roman" w:hAnsi="Times New Roman"/>
       <w:color w:val="000000"/>
-      <w:sz w:val="24"/>
+      <w:sz w:val="26"/>
     </w:rPr>
   </w:style>
   <w:style w:customStyle="1" w:styleId="FirstParagraph" w:type="paragraph">
@@ -23986,13 +23986,13 @@
     <w:next w:val="BodyText"/>
     <w:qFormat/>
     <w:pPr>
-      <w:spacing w:line="276" w:lineRule="auto"/>
+      <w:spacing w:line="288" w:lineRule="auto"/>
       <w:jc w:val="both"/>
     </w:pPr>
     <w:rPr>
       <w:rFonts w:ascii="Times New Roman" w:eastAsia="Times New Roman" w:hAnsi="Times New Roman"/>
       <w:color w:val="000000"/>
-      <w:sz w:val="24"/>
+      <w:sz w:val="26"/>
     </w:rPr>
   </w:style>
   <w:style w:customStyle="1" w:styleId="Compact" w:type="paragraph">
@@ -24000,13 +24000,13 @@
     <w:basedOn w:val="BodyText"/>
     <w:qFormat/>
     <w:pPr>
-      <w:spacing w:after="36" w:before="36" w:line="276" w:lineRule="auto"/>
+      <w:spacing w:after="36" w:before="36" w:line="288" w:lineRule="auto"/>
       <w:jc w:val="both"/>
     </w:pPr>
     <w:rPr>
       <w:rFonts w:ascii="Times New Roman" w:eastAsia="Times New Roman" w:hAnsi="Times New Roman"/>
       <w:color w:val="000000"/>
-      <w:sz w:val="24"/>
+      <w:sz w:val="26"/>
     </w:rPr>
   </w:style>
   <w:style w:styleId="Title" w:type="paragraph">
@@ -24017,7 +24017,7 @@
     <w:pPr>
       <w:keepNext/>
       <w:keepLines/>
-      <w:spacing w:after="240" w:before="480" w:line="276" w:lineRule="auto"/>
+      <w:spacing w:after="240" w:before="480" w:line="288" w:lineRule="auto"/>
       <w:jc w:val="both"/>
     </w:pPr>
     <w:rPr>
@@ -24025,7 +24025,7 @@
       <w:b/>
       <w:bCs/>
       <w:color w:val="000000"/>
-      <w:sz w:val="24"/>
+      <w:sz w:val="26"/>
       <w:szCs w:val="36"/>
     </w:rPr>
   </w:style>
@@ -24037,13 +24037,13 @@
     <w:pPr>
       <w:keepNext/>
       <w:keepLines/>
-      <w:spacing w:after="240" w:before="240" w:line="276" w:lineRule="auto"/>
+      <w:spacing w:after="240" w:before="240" w:line="288" w:lineRule="auto"/>
       <w:jc w:val="both"/>
     </w:pPr>
     <w:rPr>
       <w:rFonts w:ascii="Times New Roman" w:eastAsia="Times New Roman" w:hAnsi="Times New Roman"/>
       <w:color w:val="000000"/>
-      <w:sz w:val="24"/>
+      <w:sz w:val="26"/>
       <w:szCs w:val="30"/>
     </w:rPr>
   </w:style>
@@ -24054,13 +24054,13 @@
     <w:pPr>
       <w:keepNext/>
       <w:keepLines/>
-      <w:spacing w:line="276" w:lineRule="auto"/>
+      <w:spacing w:line="288" w:lineRule="auto"/>
       <w:jc w:val="both"/>
     </w:pPr>
     <w:rPr>
       <w:rFonts w:ascii="Times New Roman" w:eastAsia="Times New Roman" w:hAnsi="Times New Roman"/>
       <w:color w:val="000000"/>
-      <w:sz w:val="24"/>
+      <w:sz w:val="26"/>
     </w:rPr>
   </w:style>
   <w:style w:styleId="Date" w:type="paragraph">
@@ -24070,13 +24070,13 @@
     <w:pPr>
       <w:keepNext/>
       <w:keepLines/>
-      <w:spacing w:line="276" w:lineRule="auto"/>
+      <w:spacing w:line="288" w:lineRule="auto"/>
       <w:jc w:val="both"/>
     </w:pPr>
     <w:rPr>
       <w:rFonts w:ascii="Times New Roman" w:eastAsia="Times New Roman" w:hAnsi="Times New Roman"/>
       <w:color w:val="000000"/>
-      <w:sz w:val="24"/>
+      <w:sz w:val="26"/>
     </w:rPr>
   </w:style>
   <w:style w:customStyle="1" w:styleId="AbstractTitle" w:type="paragraph">
@@ -24088,11 +24088,11 @@
       <w:keepNext/>
       <w:keepLines/>
       <w:jc w:val="both"/>
-      <w:spacing w:after="0" w:before="300" w:line="276" w:lineRule="auto"/>
+      <w:spacing w:after="0" w:before="300" w:line="288" w:lineRule="auto"/>
     </w:pPr>
     <w:rPr>
       <w:color w:val="000000"/>
-      <w:sz w:val="24"/>
+      <w:sz w:val="26"/>
       <w:szCs w:val="20"/>
       <w:rFonts w:ascii="Times New Roman" w:eastAsia="Times New Roman" w:hAnsi="Times New Roman"/>
       <w:b/>
@@ -24106,13 +24106,13 @@
     <w:pPr>
       <w:keepNext/>
       <w:keepLines/>
-      <w:spacing w:after="300" w:before="100" w:line="276" w:lineRule="auto"/>
+      <w:spacing w:after="300" w:before="100" w:line="288" w:lineRule="auto"/>
       <w:jc w:val="both"/>
     </w:pPr>
     <w:rPr>
       <w:rFonts w:ascii="Times New Roman" w:eastAsia="Times New Roman" w:hAnsi="Times New Roman"/>
       <w:color w:val="000000"/>
-      <w:sz w:val="24"/>
+      <w:sz w:val="26"/>
       <w:szCs w:val="20"/>
     </w:rPr>
   </w:style>
@@ -24122,13 +24122,13 @@
     <w:next w:val="Bibliography"/>
     <w:qFormat/>
     <w:pPr>
-      <w:spacing w:line="276" w:lineRule="auto"/>
+      <w:spacing w:line="288" w:lineRule="auto"/>
       <w:jc w:val="both"/>
     </w:pPr>
     <w:rPr>
       <w:rFonts w:ascii="Times New Roman" w:eastAsia="Times New Roman" w:hAnsi="Times New Roman"/>
       <w:color w:val="000000"/>
-      <w:sz w:val="24"/>
+      <w:sz w:val="26"/>
     </w:rPr>
   </w:style>
   <w:style w:styleId="Heading1" w:type="paragraph">
@@ -24140,7 +24140,7 @@
     <w:pPr>
       <w:keepNext/>
       <w:keepLines/>
-      <w:spacing w:after="0" w:before="480" w:line="276" w:lineRule="auto"/>
+      <w:spacing w:after="0" w:before="480" w:line="288" w:lineRule="auto"/>
       <w:jc w:val="both"/>
       <w:outlineLvl w:val="0"/>
     </w:pPr>
@@ -24149,7 +24149,7 @@
       <w:b/>
       <w:bCs/>
       <w:color w:val="000000"/>
-      <w:sz w:val="24"/>
+      <w:sz w:val="26"/>
       <w:szCs w:val="32"/>
     </w:rPr>
   </w:style>
@@ -24163,7 +24163,7 @@
     <w:pPr>
       <w:keepNext/>
       <w:keepLines/>
-      <w:spacing w:after="0" w:before="200" w:line="276" w:lineRule="auto"/>
+      <w:spacing w:after="0" w:before="200" w:line="288" w:lineRule="auto"/>
       <w:jc w:val="both"/>
       <w:outlineLvl w:val="1"/>
     </w:pPr>
@@ -24172,7 +24172,7 @@
       <w:b/>
       <w:bCs/>
       <w:color w:val="000000"/>
-      <w:sz w:val="24"/>
+      <w:sz w:val="26"/>
       <w:szCs w:val="28"/>
     </w:rPr>
   </w:style>
@@ -24186,7 +24186,7 @@
     <w:pPr>
       <w:keepNext/>
       <w:keepLines/>
-      <w:spacing w:after="0" w:before="200" w:line="276" w:lineRule="auto"/>
+      <w:spacing w:after="0" w:before="200" w:line="288" w:lineRule="auto"/>
       <w:jc w:val="both"/>
       <w:outlineLvl w:val="2"/>
     </w:pPr>
@@ -24195,7 +24195,7 @@
       <w:b/>
       <w:bCs/>
       <w:color w:val="000000"/>
-      <w:sz w:val="24"/>
+      <w:sz w:val="26"/>
       <w:szCs w:val="24"/>
     </w:rPr>
   </w:style>
@@ -24209,7 +24209,7 @@
     <w:pPr>
       <w:keepNext/>
       <w:keepLines/>
-      <w:spacing w:after="0" w:before="200" w:line="276" w:lineRule="auto"/>
+      <w:spacing w:after="0" w:before="200" w:line="288" w:lineRule="auto"/>
       <w:jc w:val="both"/>
       <w:outlineLvl w:val="3"/>
     </w:pPr>
@@ -24218,7 +24218,7 @@
       <w:i/>
       <w:bCs/>
       <w:color w:val="000000"/>
-      <w:sz w:val="24"/>
+      <w:sz w:val="26"/>
       <w:szCs w:val="24"/>
     </w:rPr>
   </w:style>
@@ -24232,7 +24232,7 @@
     <w:pPr>
       <w:keepNext/>
       <w:keepLines/>
-      <w:spacing w:after="0" w:before="200" w:line="276" w:lineRule="auto"/>
+      <w:spacing w:after="0" w:before="200" w:line="288" w:lineRule="auto"/>
       <w:jc w:val="both"/>
       <w:outlineLvl w:val="4"/>
     </w:pPr>
@@ -24240,7 +24240,7 @@
       <w:rFonts w:ascii="Times New Roman" w:asciiTheme="majorHAnsi" w:cstheme="majorBidi" w:eastAsia="Times New Roman" w:eastAsiaTheme="majorEastAsia" w:hAnsi="Times New Roman" w:hAnsiTheme="majorHAnsi"/>
       <w:iCs/>
       <w:color w:val="000000"/>
-      <w:sz w:val="24"/>
+      <w:sz w:val="26"/>
       <w:szCs w:val="24"/>
     </w:rPr>
   </w:style>
@@ -24254,14 +24254,14 @@
     <w:pPr>
       <w:keepNext/>
       <w:keepLines/>
-      <w:spacing w:after="0" w:before="200" w:line="276" w:lineRule="auto"/>
+      <w:spacing w:after="0" w:before="200" w:line="288" w:lineRule="auto"/>
       <w:jc w:val="both"/>
       <w:outlineLvl w:val="5"/>
     </w:pPr>
     <w:rPr>
       <w:rFonts w:ascii="Times New Roman" w:asciiTheme="majorHAnsi" w:cstheme="majorBidi" w:eastAsia="Times New Roman" w:eastAsiaTheme="majorEastAsia" w:hAnsi="Times New Roman" w:hAnsiTheme="majorHAnsi"/>
       <w:color w:val="000000"/>
-      <w:sz w:val="24"/>
+      <w:sz w:val="26"/>
       <w:szCs w:val="24"/>
     </w:rPr>
   </w:style>
@@ -24275,14 +24275,14 @@
     <w:pPr>
       <w:keepNext/>
       <w:keepLines/>
-      <w:spacing w:after="0" w:before="200" w:line="276" w:lineRule="auto"/>
+      <w:spacing w:after="0" w:before="200" w:line="288" w:lineRule="auto"/>
       <w:jc w:val="both"/>
       <w:outlineLvl w:val="6"/>
     </w:pPr>
     <w:rPr>
       <w:rFonts w:ascii="Times New Roman" w:asciiTheme="majorHAnsi" w:cstheme="majorBidi" w:eastAsia="Times New Roman" w:eastAsiaTheme="majorEastAsia" w:hAnsi="Times New Roman" w:hAnsiTheme="majorHAnsi"/>
       <w:color w:val="000000"/>
-      <w:sz w:val="24"/>
+      <w:sz w:val="26"/>
       <w:szCs w:val="24"/>
     </w:rPr>
   </w:style>
@@ -24296,14 +24296,14 @@
     <w:pPr>
       <w:keepNext/>
       <w:keepLines/>
-      <w:spacing w:after="0" w:before="200" w:line="276" w:lineRule="auto"/>
+      <w:spacing w:after="0" w:before="200" w:line="288" w:lineRule="auto"/>
       <w:jc w:val="both"/>
       <w:outlineLvl w:val="7"/>
     </w:pPr>
     <w:rPr>
       <w:rFonts w:ascii="Times New Roman" w:asciiTheme="majorHAnsi" w:cstheme="majorBidi" w:eastAsia="Times New Roman" w:eastAsiaTheme="majorEastAsia" w:hAnsi="Times New Roman" w:hAnsiTheme="majorHAnsi"/>
       <w:color w:val="000000"/>
-      <w:sz w:val="24"/>
+      <w:sz w:val="26"/>
       <w:szCs w:val="24"/>
     </w:rPr>
   </w:style>
@@ -24317,14 +24317,14 @@
     <w:pPr>
       <w:keepNext/>
       <w:keepLines/>
-      <w:spacing w:after="0" w:before="200" w:line="276" w:lineRule="auto"/>
+      <w:spacing w:after="0" w:before="200" w:line="288" w:lineRule="auto"/>
       <w:jc w:val="both"/>
       <w:outlineLvl w:val="8"/>
     </w:pPr>
     <w:rPr>
       <w:rFonts w:ascii="Times New Roman" w:asciiTheme="majorHAnsi" w:cstheme="majorBidi" w:eastAsia="Times New Roman" w:eastAsiaTheme="majorEastAsia" w:hAnsi="Times New Roman" w:hAnsiTheme="majorHAnsi"/>
       <w:color w:val="000000"/>
-      <w:sz w:val="24"/>
+      <w:sz w:val="26"/>
       <w:szCs w:val="24"/>
     </w:rPr>
   </w:style>
@@ -24336,14 +24336,14 @@
     <w:unhideWhenUsed/>
     <w:qFormat/>
     <w:pPr>
-      <w:spacing w:after="100" w:before="100" w:line="276" w:lineRule="auto"/>
+      <w:spacing w:after="100" w:before="100" w:line="288" w:lineRule="auto"/>
       <w:ind w:firstLine="0" w:left="480" w:right="480"/>
       <w:jc w:val="both"/>
     </w:pPr>
     <w:rPr>
       <w:rFonts w:ascii="Times New Roman" w:eastAsia="Times New Roman" w:hAnsi="Times New Roman"/>
       <w:color w:val="000000"/>
-      <w:sz w:val="24"/>
+      <w:sz w:val="26"/>
     </w:rPr>
   </w:style>
   <w:style w:styleId="FootnoteText" w:type="paragraph">
@@ -24354,13 +24354,13 @@
     <w:unhideWhenUsed/>
     <w:qFormat/>
     <w:pPr>
-      <w:spacing w:line="276" w:lineRule="auto"/>
+      <w:spacing w:line="288" w:lineRule="auto"/>
       <w:jc w:val="both"/>
     </w:pPr>
     <w:rPr>
       <w:rFonts w:ascii="Times New Roman" w:eastAsia="Times New Roman" w:hAnsi="Times New Roman"/>
       <w:color w:val="000000"/>
-      <w:sz w:val="24"/>
+      <w:sz w:val="26"/>
     </w:rPr>
   </w:style>
   <w:style w:default="1" w:styleId="DefaultParagraphFont" w:type="character">
@@ -24370,7 +24370,7 @@
     <w:rPr>
       <w:rFonts w:ascii="Times New Roman" w:eastAsia="Times New Roman" w:hAnsi="Times New Roman"/>
       <w:color w:val="000000"/>
-      <w:sz w:val="24"/>
+      <w:sz w:val="26"/>
     </w:rPr>
   </w:style>
   <w:style w:default="1" w:styleId="Table" w:type="table">
@@ -24380,13 +24380,13 @@
     <w:unhideWhenUsed/>
     <w:qFormat/>
     <w:pPr>
-      <w:spacing w:line="276" w:lineRule="auto"/>
+      <w:spacing w:line="288" w:lineRule="auto"/>
       <w:jc w:val="both"/>
     </w:pPr>
     <w:rPr>
       <w:rFonts w:ascii="Times New Roman" w:eastAsia="Times New Roman" w:hAnsi="Times New Roman"/>
       <w:color w:val="000000"/>
-      <w:sz w:val="24"/>
+      <w:sz w:val="26"/>
     </w:rPr>
     <w:tblPr>
       <w:tblInd w:type="dxa" w:w="0"/>
@@ -24420,27 +24420,27 @@
     <w:pPr>
       <w:keepNext/>
       <w:keepLines/>
-      <w:spacing w:after="0" w:line="276" w:lineRule="auto"/>
+      <w:spacing w:after="0" w:line="288" w:lineRule="auto"/>
       <w:jc w:val="both"/>
     </w:pPr>
     <w:rPr>
       <w:rFonts w:ascii="Times New Roman" w:eastAsia="Times New Roman" w:hAnsi="Times New Roman"/>
       <w:b/>
       <w:color w:val="000000"/>
-      <w:sz w:val="24"/>
+      <w:sz w:val="26"/>
     </w:rPr>
   </w:style>
   <w:style w:customStyle="1" w:styleId="Definition" w:type="paragraph">
     <w:name w:val="Definition"/>
     <w:basedOn w:val="Normal"/>
     <w:pPr>
-      <w:spacing w:line="276" w:lineRule="auto"/>
+      <w:spacing w:line="288" w:lineRule="auto"/>
       <w:jc w:val="both"/>
     </w:pPr>
     <w:rPr>
       <w:rFonts w:ascii="Times New Roman" w:eastAsia="Times New Roman" w:hAnsi="Times New Roman"/>
       <w:color w:val="000000"/>
-      <w:sz w:val="24"/>
+      <w:sz w:val="26"/>
     </w:rPr>
   </w:style>
   <w:style w:styleId="Caption" w:type="paragraph">
@@ -24448,14 +24448,14 @@
     <w:basedOn w:val="Normal"/>
     <w:link w:val="BodyTextChar"/>
     <w:pPr>
-      <w:spacing w:after="120" w:before="0" w:line="276" w:lineRule="auto"/>
+      <w:spacing w:after="120" w:before="0" w:line="288" w:lineRule="auto"/>
       <w:jc w:val="both"/>
     </w:pPr>
     <w:rPr>
       <w:rFonts w:ascii="Times New Roman" w:eastAsia="Times New Roman" w:hAnsi="Times New Roman"/>
       <w:i/>
       <w:color w:val="000000"/>
-      <w:sz w:val="24"/>
+      <w:sz w:val="26"/>
     </w:rPr>
   </w:style>
   <w:style w:customStyle="1" w:styleId="TableCaption" w:type="paragraph">
@@ -24463,39 +24463,39 @@
     <w:basedOn w:val="Caption"/>
     <w:pPr>
       <w:keepNext/>
-      <w:spacing w:line="276" w:lineRule="auto"/>
+      <w:spacing w:line="288" w:lineRule="auto"/>
       <w:jc w:val="both"/>
     </w:pPr>
     <w:rPr>
       <w:rFonts w:ascii="Times New Roman" w:eastAsia="Times New Roman" w:hAnsi="Times New Roman"/>
       <w:color w:val="000000"/>
-      <w:sz w:val="24"/>
+      <w:sz w:val="26"/>
     </w:rPr>
   </w:style>
   <w:style w:customStyle="1" w:styleId="ImageCaption" w:type="paragraph">
     <w:name w:val="Image Caption"/>
     <w:basedOn w:val="Caption"/>
     <w:pPr>
-      <w:spacing w:line="276" w:lineRule="auto"/>
+      <w:spacing w:line="288" w:lineRule="auto"/>
       <w:jc w:val="both"/>
     </w:pPr>
     <w:rPr>
       <w:rFonts w:ascii="Times New Roman" w:eastAsia="Times New Roman" w:hAnsi="Times New Roman"/>
       <w:color w:val="000000"/>
-      <w:sz w:val="24"/>
+      <w:sz w:val="26"/>
     </w:rPr>
   </w:style>
   <w:style w:customStyle="1" w:styleId="Figure" w:type="paragraph">
     <w:name w:val="Figure"/>
     <w:basedOn w:val="Normal"/>
     <w:pPr>
-      <w:spacing w:line="276" w:lineRule="auto"/>
+      <w:spacing w:line="288" w:lineRule="auto"/>
       <w:jc w:val="both"/>
     </w:pPr>
     <w:rPr>
       <w:rFonts w:ascii="Times New Roman" w:eastAsia="Times New Roman" w:hAnsi="Times New Roman"/>
       <w:color w:val="000000"/>
-      <w:sz w:val="24"/>
+      <w:sz w:val="26"/>
     </w:rPr>
   </w:style>
   <w:style w:customStyle="1" w:styleId="CaptionedFigure" w:type="paragraph">
@@ -24503,13 +24503,13 @@
     <w:basedOn w:val="Figure"/>
     <w:pPr>
       <w:keepNext/>
-      <w:spacing w:line="276" w:lineRule="auto"/>
+      <w:spacing w:line="288" w:lineRule="auto"/>
       <w:jc w:val="both"/>
     </w:pPr>
     <w:rPr>
       <w:rFonts w:ascii="Times New Roman" w:eastAsia="Times New Roman" w:hAnsi="Times New Roman"/>
       <w:color w:val="000000"/>
-      <w:sz w:val="24"/>
+      <w:sz w:val="26"/>
     </w:rPr>
   </w:style>
   <w:style w:customStyle="1" w:styleId="BodyTextChar" w:type="character">
@@ -24519,7 +24519,7 @@
     <w:rPr>
       <w:rFonts w:ascii="Times New Roman" w:eastAsia="Times New Roman" w:hAnsi="Times New Roman"/>
       <w:color w:val="000000"/>
-      <w:sz w:val="24"/>
+      <w:sz w:val="26"/>
     </w:rPr>
   </w:style>
   <w:style w:customStyle="1" w:styleId="VerbatimChar" w:type="character">
@@ -24528,7 +24528,7 @@
     <w:rPr>
       <w:rFonts w:ascii="Times New Roman" w:eastAsia="Times New Roman" w:hAnsi="Times New Roman"/>
       <w:color w:val="000000"/>
-      <w:sz w:val="24"/>
+      <w:sz w:val="26"/>
     </w:rPr>
   </w:style>
   <w:style w:customStyle="1" w:styleId="SectionNumber" w:type="character">
@@ -24537,7 +24537,7 @@
     <w:rPr>
       <w:rFonts w:ascii="Times New Roman" w:eastAsia="Times New Roman" w:hAnsi="Times New Roman"/>
       <w:color w:val="000000"/>
-      <w:sz w:val="24"/>
+      <w:sz w:val="26"/>
     </w:rPr>
   </w:style>
   <w:style w:styleId="FootnoteReference" w:type="character">
@@ -24546,7 +24546,7 @@
     <w:rPr>
       <w:rFonts w:ascii="Times New Roman" w:eastAsia="Times New Roman" w:hAnsi="Times New Roman"/>
       <w:color w:val="000000"/>
-      <w:sz w:val="24"/>
+      <w:sz w:val="26"/>
       <w:vertAlign w:val="superscript"/>
     </w:rPr>
   </w:style>
@@ -24556,7 +24556,7 @@
     <w:rPr>
       <w:rFonts w:ascii="Times New Roman" w:eastAsia="Times New Roman" w:hAnsi="Times New Roman"/>
       <w:color w:val="000000"/>
-      <w:sz w:val="24"/>
+      <w:sz w:val="26"/>
     </w:rPr>
   </w:style>
   <w:style w:styleId="TOCHeading" w:type="paragraph">
@@ -24567,7 +24567,7 @@
     <w:unhideWhenUsed/>
     <w:qFormat/>
     <w:pPr>
-      <w:spacing w:before="240" w:line="276" w:lineRule="auto"/>
+      <w:spacing w:before="240" w:line="288" w:lineRule="auto"/>
       <w:jc w:val="both"/>
       <w:outlineLvl w:val="9"/>
     </w:pPr>
@@ -24576,242 +24576,317 @@
       <w:b w:val="0"/>
       <w:bCs w:val="0"/>
       <w:color w:val="000000"/>
-      <w:sz w:val="24"/>
+      <w:sz w:val="26"/>
     </w:rPr>
   </w:style>
-  <w:style w:type="paragraph" w:customStyle="1" w:styleId="SourceCode">
+  <w:style w:customStyle="1" w:styleId="SourceCode" w:type="paragraph">
     <w:name w:val="Source Code"/>
     <w:basedOn w:val="Normal"/>
     <w:link w:val="VerbatimChar"/>
     <w:pPr>
       <w:wordWrap w:val="off"/>
+      <w:spacing w:line="288" w:lineRule="auto"/>
+      <w:jc w:val="both"/>
     </w:pPr>
+    <w:rPr>
+      <w:rFonts w:ascii="Times New Roman" w:eastAsia="Times New Roman" w:hAnsi="Times New Roman"/>
+      <w:color w:val="000000"/>
+      <w:sz w:val="26"/>
+    </w:rPr>
   </w:style>
-  <w:style w:type="character" w:customStyle="1" w:styleId="KeywordTok">
+  <w:style w:customStyle="1" w:styleId="KeywordTok" w:type="character">
     <w:name w:val="KeywordTok"/>
     <w:basedOn w:val="VerbatimChar"/>
     <w:rPr>
-      <w:color w:val="007020"/>
+      <w:rFonts w:ascii="Times New Roman" w:eastAsia="Times New Roman" w:hAnsi="Times New Roman"/>
       <w:b/>
+      <w:color w:val="000000"/>
+      <w:sz w:val="26"/>
     </w:rPr>
   </w:style>
-  <w:style w:type="character" w:customStyle="1" w:styleId="DataTypeTok">
+  <w:style w:customStyle="1" w:styleId="DataTypeTok" w:type="character">
     <w:name w:val="DataTypeTok"/>
     <w:basedOn w:val="VerbatimChar"/>
     <w:rPr>
-      <w:color w:val="902000"/>
+      <w:rFonts w:ascii="Times New Roman" w:eastAsia="Times New Roman" w:hAnsi="Times New Roman"/>
+      <w:color w:val="000000"/>
+      <w:sz w:val="26"/>
     </w:rPr>
   </w:style>
-  <w:style w:type="character" w:customStyle="1" w:styleId="DecValTok">
+  <w:style w:customStyle="1" w:styleId="DecValTok" w:type="character">
     <w:name w:val="DecValTok"/>
     <w:basedOn w:val="VerbatimChar"/>
     <w:rPr>
-      <w:color w:val="40a070"/>
+      <w:rFonts w:ascii="Times New Roman" w:eastAsia="Times New Roman" w:hAnsi="Times New Roman"/>
+      <w:color w:val="000000"/>
+      <w:sz w:val="26"/>
     </w:rPr>
   </w:style>
-  <w:style w:type="character" w:customStyle="1" w:styleId="BaseNTok">
+  <w:style w:customStyle="1" w:styleId="BaseNTok" w:type="character">
     <w:name w:val="BaseNTok"/>
     <w:basedOn w:val="VerbatimChar"/>
     <w:rPr>
-      <w:color w:val="40a070"/>
+      <w:rFonts w:ascii="Times New Roman" w:eastAsia="Times New Roman" w:hAnsi="Times New Roman"/>
+      <w:color w:val="000000"/>
+      <w:sz w:val="26"/>
     </w:rPr>
   </w:style>
-  <w:style w:type="character" w:customStyle="1" w:styleId="FloatTok">
+  <w:style w:customStyle="1" w:styleId="FloatTok" w:type="character">
     <w:name w:val="FloatTok"/>
     <w:basedOn w:val="VerbatimChar"/>
     <w:rPr>
-      <w:color w:val="40a070"/>
+      <w:rFonts w:ascii="Times New Roman" w:eastAsia="Times New Roman" w:hAnsi="Times New Roman"/>
+      <w:color w:val="000000"/>
+      <w:sz w:val="26"/>
     </w:rPr>
   </w:style>
-  <w:style w:type="character" w:customStyle="1" w:styleId="ConstantTok">
+  <w:style w:customStyle="1" w:styleId="ConstantTok" w:type="character">
     <w:name w:val="ConstantTok"/>
     <w:basedOn w:val="VerbatimChar"/>
     <w:rPr>
-      <w:color w:val="880000"/>
+      <w:rFonts w:ascii="Times New Roman" w:eastAsia="Times New Roman" w:hAnsi="Times New Roman"/>
+      <w:color w:val="000000"/>
+      <w:sz w:val="26"/>
     </w:rPr>
   </w:style>
-  <w:style w:type="character" w:customStyle="1" w:styleId="CharTok">
+  <w:style w:customStyle="1" w:styleId="CharTok" w:type="character">
     <w:name w:val="CharTok"/>
     <w:basedOn w:val="VerbatimChar"/>
     <w:rPr>
-      <w:color w:val="4070a0"/>
+      <w:rFonts w:ascii="Times New Roman" w:eastAsia="Times New Roman" w:hAnsi="Times New Roman"/>
+      <w:color w:val="000000"/>
+      <w:sz w:val="26"/>
     </w:rPr>
   </w:style>
-  <w:style w:type="character" w:customStyle="1" w:styleId="SpecialCharTok">
+  <w:style w:customStyle="1" w:styleId="SpecialCharTok" w:type="character">
     <w:name w:val="SpecialCharTok"/>
     <w:basedOn w:val="VerbatimChar"/>
     <w:rPr>
-      <w:color w:val="4070a0"/>
+      <w:rFonts w:ascii="Times New Roman" w:eastAsia="Times New Roman" w:hAnsi="Times New Roman"/>
+      <w:color w:val="000000"/>
+      <w:sz w:val="26"/>
     </w:rPr>
   </w:style>
-  <w:style w:type="character" w:customStyle="1" w:styleId="StringTok">
+  <w:style w:customStyle="1" w:styleId="StringTok" w:type="character">
     <w:name w:val="StringTok"/>
     <w:basedOn w:val="VerbatimChar"/>
     <w:rPr>
-      <w:color w:val="4070a0"/>
+      <w:rFonts w:ascii="Times New Roman" w:eastAsia="Times New Roman" w:hAnsi="Times New Roman"/>
+      <w:color w:val="000000"/>
+      <w:sz w:val="26"/>
     </w:rPr>
   </w:style>
-  <w:style w:type="character" w:customStyle="1" w:styleId="VerbatimStringTok">
+  <w:style w:customStyle="1" w:styleId="VerbatimStringTok" w:type="character">
     <w:name w:val="VerbatimStringTok"/>
     <w:basedOn w:val="VerbatimChar"/>
     <w:rPr>
-      <w:color w:val="4070a0"/>
+      <w:rFonts w:ascii="Times New Roman" w:eastAsia="Times New Roman" w:hAnsi="Times New Roman"/>
+      <w:color w:val="000000"/>
+      <w:sz w:val="26"/>
     </w:rPr>
   </w:style>
-  <w:style w:type="character" w:customStyle="1" w:styleId="SpecialStringTok">
+  <w:style w:customStyle="1" w:styleId="SpecialStringTok" w:type="character">
     <w:name w:val="SpecialStringTok"/>
     <w:basedOn w:val="VerbatimChar"/>
     <w:rPr>
-      <w:color w:val="bb6688"/>
+      <w:rFonts w:ascii="Times New Roman" w:eastAsia="Times New Roman" w:hAnsi="Times New Roman"/>
+      <w:color w:val="000000"/>
+      <w:sz w:val="26"/>
     </w:rPr>
   </w:style>
-  <w:style w:type="character" w:customStyle="1" w:styleId="ImportTok">
+  <w:style w:customStyle="1" w:styleId="ImportTok" w:type="character">
     <w:name w:val="ImportTok"/>
     <w:basedOn w:val="VerbatimChar"/>
     <w:rPr>
-      <w:color w:val="008000"/>
+      <w:rFonts w:ascii="Times New Roman" w:eastAsia="Times New Roman" w:hAnsi="Times New Roman"/>
       <w:b/>
+      <w:color w:val="000000"/>
+      <w:sz w:val="26"/>
     </w:rPr>
   </w:style>
-  <w:style w:type="character" w:customStyle="1" w:styleId="CommentTok">
+  <w:style w:customStyle="1" w:styleId="CommentTok" w:type="character">
     <w:name w:val="CommentTok"/>
     <w:basedOn w:val="VerbatimChar"/>
     <w:rPr>
-      <w:color w:val="60a0b0"/>
+      <w:rFonts w:ascii="Times New Roman" w:eastAsia="Times New Roman" w:hAnsi="Times New Roman"/>
       <w:i/>
+      <w:color w:val="000000"/>
+      <w:sz w:val="26"/>
     </w:rPr>
   </w:style>
-  <w:style w:type="character" w:customStyle="1" w:styleId="DocumentationTok">
+  <w:style w:customStyle="1" w:styleId="DocumentationTok" w:type="character">
     <w:name w:val="DocumentationTok"/>
     <w:basedOn w:val="VerbatimChar"/>
     <w:rPr>
-      <w:color w:val="ba2121"/>
+      <w:rFonts w:ascii="Times New Roman" w:eastAsia="Times New Roman" w:hAnsi="Times New Roman"/>
       <w:i/>
+      <w:color w:val="000000"/>
+      <w:sz w:val="26"/>
     </w:rPr>
   </w:style>
-  <w:style w:type="character" w:customStyle="1" w:styleId="AnnotationTok">
+  <w:style w:customStyle="1" w:styleId="AnnotationTok" w:type="character">
     <w:name w:val="AnnotationTok"/>
     <w:basedOn w:val="VerbatimChar"/>
     <w:rPr>
-      <w:color w:val="60a0b0"/>
+      <w:rFonts w:ascii="Times New Roman" w:eastAsia="Times New Roman" w:hAnsi="Times New Roman"/>
       <w:b/>
       <w:i/>
+      <w:color w:val="000000"/>
+      <w:sz w:val="26"/>
     </w:rPr>
   </w:style>
-  <w:style w:type="character" w:customStyle="1" w:styleId="CommentVarTok">
+  <w:style w:customStyle="1" w:styleId="CommentVarTok" w:type="character">
     <w:name w:val="CommentVarTok"/>
     <w:basedOn w:val="VerbatimChar"/>
     <w:rPr>
-      <w:color w:val="60a0b0"/>
+      <w:rFonts w:ascii="Times New Roman" w:eastAsia="Times New Roman" w:hAnsi="Times New Roman"/>
       <w:b/>
       <w:i/>
+      <w:color w:val="000000"/>
+      <w:sz w:val="26"/>
     </w:rPr>
   </w:style>
-  <w:style w:type="character" w:customStyle="1" w:styleId="OtherTok">
+  <w:style w:customStyle="1" w:styleId="OtherTok" w:type="character">
     <w:name w:val="OtherTok"/>
     <w:basedOn w:val="VerbatimChar"/>
     <w:rPr>
-      <w:color w:val="007020"/>
+      <w:rFonts w:ascii="Times New Roman" w:eastAsia="Times New Roman" w:hAnsi="Times New Roman"/>
+      <w:color w:val="000000"/>
+      <w:sz w:val="26"/>
     </w:rPr>
   </w:style>
-  <w:style w:type="character" w:customStyle="1" w:styleId="FunctionTok">
+  <w:style w:customStyle="1" w:styleId="FunctionTok" w:type="character">
     <w:name w:val="FunctionTok"/>
     <w:basedOn w:val="VerbatimChar"/>
     <w:rPr>
-      <w:color w:val="06287e"/>
+      <w:rFonts w:ascii="Times New Roman" w:eastAsia="Times New Roman" w:hAnsi="Times New Roman"/>
+      <w:color w:val="000000"/>
+      <w:sz w:val="26"/>
     </w:rPr>
   </w:style>
-  <w:style w:type="character" w:customStyle="1" w:styleId="VariableTok">
+  <w:style w:customStyle="1" w:styleId="VariableTok" w:type="character">
     <w:name w:val="VariableTok"/>
     <w:basedOn w:val="VerbatimChar"/>
     <w:rPr>
-      <w:color w:val="19177c"/>
+      <w:rFonts w:ascii="Times New Roman" w:eastAsia="Times New Roman" w:hAnsi="Times New Roman"/>
+      <w:color w:val="000000"/>
+      <w:sz w:val="26"/>
     </w:rPr>
   </w:style>
-  <w:style w:type="character" w:customStyle="1" w:styleId="ControlFlowTok">
+  <w:style w:customStyle="1" w:styleId="ControlFlowTok" w:type="character">
     <w:name w:val="ControlFlowTok"/>
     <w:basedOn w:val="VerbatimChar"/>
     <w:rPr>
-      <w:color w:val="007020"/>
+      <w:rFonts w:ascii="Times New Roman" w:eastAsia="Times New Roman" w:hAnsi="Times New Roman"/>
       <w:b/>
+      <w:color w:val="000000"/>
+      <w:sz w:val="26"/>
     </w:rPr>
   </w:style>
-  <w:style w:type="character" w:customStyle="1" w:styleId="OperatorTok">
+  <w:style w:customStyle="1" w:styleId="OperatorTok" w:type="character">
     <w:name w:val="OperatorTok"/>
     <w:basedOn w:val="VerbatimChar"/>
     <w:rPr>
-      <w:color w:val="666666"/>
+      <w:rFonts w:ascii="Times New Roman" w:eastAsia="Times New Roman" w:hAnsi="Times New Roman"/>
+      <w:color w:val="000000"/>
+      <w:sz w:val="26"/>
     </w:rPr>
   </w:style>
-  <w:style w:type="character" w:customStyle="1" w:styleId="BuiltInTok">
+  <w:style w:customStyle="1" w:styleId="BuiltInTok" w:type="character">
     <w:name w:val="BuiltInTok"/>
     <w:basedOn w:val="VerbatimChar"/>
     <w:rPr>
-      <w:color w:val="008000"/>
+      <w:rFonts w:ascii="Times New Roman" w:eastAsia="Times New Roman" w:hAnsi="Times New Roman"/>
+      <w:color w:val="000000"/>
+      <w:sz w:val="26"/>
     </w:rPr>
   </w:style>
-  <w:style w:type="character" w:customStyle="1" w:styleId="ExtensionTok">
+  <w:style w:customStyle="1" w:styleId="ExtensionTok" w:type="character">
     <w:name w:val="ExtensionTok"/>
     <w:basedOn w:val="VerbatimChar"/>
-    <w:rPr/>
+    <w:rPr>
+      <w:rFonts w:ascii="Times New Roman" w:eastAsia="Times New Roman" w:hAnsi="Times New Roman"/>
+      <w:color w:val="000000"/>
+      <w:sz w:val="26"/>
+    </w:rPr>
   </w:style>
-  <w:style w:type="character" w:customStyle="1" w:styleId="PreprocessorTok">
+  <w:style w:customStyle="1" w:styleId="PreprocessorTok" w:type="character">
     <w:name w:val="PreprocessorTok"/>
     <w:basedOn w:val="VerbatimChar"/>
     <w:rPr>
-      <w:color w:val="bc7a00"/>
+      <w:rFonts w:ascii="Times New Roman" w:eastAsia="Times New Roman" w:hAnsi="Times New Roman"/>
+      <w:color w:val="000000"/>
+      <w:sz w:val="26"/>
     </w:rPr>
   </w:style>
-  <w:style w:type="character" w:customStyle="1" w:styleId="AttributeTok">
+  <w:style w:customStyle="1" w:styleId="AttributeTok" w:type="character">
     <w:name w:val="AttributeTok"/>
     <w:basedOn w:val="VerbatimChar"/>
     <w:rPr>
-      <w:color w:val="7d9029"/>
+      <w:rFonts w:ascii="Times New Roman" w:eastAsia="Times New Roman" w:hAnsi="Times New Roman"/>
+      <w:color w:val="000000"/>
+      <w:sz w:val="26"/>
     </w:rPr>
   </w:style>
-  <w:style w:type="character" w:customStyle="1" w:styleId="RegionMarkerTok">
+  <w:style w:customStyle="1" w:styleId="RegionMarkerTok" w:type="character">
     <w:name w:val="RegionMarkerTok"/>
     <w:basedOn w:val="VerbatimChar"/>
-    <w:rPr/>
+    <w:rPr>
+      <w:rFonts w:ascii="Times New Roman" w:eastAsia="Times New Roman" w:hAnsi="Times New Roman"/>
+      <w:color w:val="000000"/>
+      <w:sz w:val="26"/>
+    </w:rPr>
   </w:style>
-  <w:style w:type="character" w:customStyle="1" w:styleId="InformationTok">
+  <w:style w:customStyle="1" w:styleId="InformationTok" w:type="character">
     <w:name w:val="InformationTok"/>
     <w:basedOn w:val="VerbatimChar"/>
     <w:rPr>
-      <w:color w:val="60a0b0"/>
+      <w:rFonts w:ascii="Times New Roman" w:eastAsia="Times New Roman" w:hAnsi="Times New Roman"/>
       <w:b/>
       <w:i/>
+      <w:color w:val="000000"/>
+      <w:sz w:val="26"/>
     </w:rPr>
   </w:style>
-  <w:style w:type="character" w:customStyle="1" w:styleId="WarningTok">
+  <w:style w:customStyle="1" w:styleId="WarningTok" w:type="character">
     <w:name w:val="WarningTok"/>
     <w:basedOn w:val="VerbatimChar"/>
     <w:rPr>
-      <w:color w:val="60a0b0"/>
+      <w:rFonts w:ascii="Times New Roman" w:eastAsia="Times New Roman" w:hAnsi="Times New Roman"/>
       <w:b/>
       <w:i/>
+      <w:color w:val="000000"/>
+      <w:sz w:val="26"/>
     </w:rPr>
   </w:style>
-  <w:style w:type="character" w:customStyle="1" w:styleId="AlertTok">
+  <w:style w:customStyle="1" w:styleId="AlertTok" w:type="character">
     <w:name w:val="AlertTok"/>
     <w:basedOn w:val="VerbatimChar"/>
     <w:rPr>
-      <w:color w:val="ff0000"/>
+      <w:rFonts w:ascii="Times New Roman" w:eastAsia="Times New Roman" w:hAnsi="Times New Roman"/>
       <w:b/>
+      <w:color w:val="000000"/>
+      <w:sz w:val="26"/>
     </w:rPr>
   </w:style>
-  <w:style w:type="character" w:customStyle="1" w:styleId="ErrorTok">
+  <w:style w:customStyle="1" w:styleId="ErrorTok" w:type="character">
     <w:name w:val="ErrorTok"/>
     <w:basedOn w:val="VerbatimChar"/>
     <w:rPr>
-      <w:color w:val="ff0000"/>
+      <w:rFonts w:ascii="Times New Roman" w:eastAsia="Times New Roman" w:hAnsi="Times New Roman"/>
       <w:b/>
+      <w:color w:val="000000"/>
+      <w:sz w:val="26"/>
     </w:rPr>
   </w:style>
-  <w:style w:type="character" w:customStyle="1" w:styleId="NormalTok">
+  <w:style w:customStyle="1" w:styleId="NormalTok" w:type="character">
     <w:name w:val="NormalTok"/>
     <w:basedOn w:val="VerbatimChar"/>
-    <w:rPr/>
+    <w:rPr>
+      <w:rFonts w:ascii="Times New Roman" w:eastAsia="Times New Roman" w:hAnsi="Times New Roman"/>
+      <w:color w:val="000000"/>
+      <w:sz w:val="26"/>
+    </w:rPr>
   </w:style>
 </w:styles>
 </file>

</xml_diff>

<commit_message>
build(submission): rebuild complete submission package (BO_NOP_HOAN_CHINH_2026-06)
Regenerate the full submission folder from the corrected sources so it reflects
this session's fixes:
- Dissertation full PDF (185pp) now includes Appendix D study S238 (k=238 closed).
- CĐ1/CĐ2 PDF+DOCX carry the number/citation/Unicode fixes (e.g. Wu, Fan & Chen;
  Bảng 2.8 reconciled; CĐ1 FSTS/BREADY/FDI corrections).
- Refreshed all 8 papers' Vietnamese translations (04_ban_dich_vi.docx) and the
  five dissertation chapters (PDF+DOCX) + front-matter/references/appendix DOCX.

Package = 1_papers (P3–P10 English bundles + VI translations) + 2_chuyen_de
(CĐ1/CĐ2) + 3_luan_an_chuong_phu_luc (full PDF + chapters + appendices).
Built via scripts/build_bo_nop_package.sh (XeLaTeX, TeX Gyre Termes); README dated.

Co-Authored-By: Claude Opus 4.8 (1M context) <noreply@anthropic.com>
Claude-Session: https://claude.ai/code/session_01Xumaoraa2DLWLXsgJJ62oq
</commit_message>
<xml_diff>
--- a/dist/BO_NOP_HOAN_CHINH_2026-06/2_chuyen_de/CD1_CTU.docx
+++ b/dist/BO_NOP_HOAN_CHINH_2026-06/2_chuyen_de/CD1_CTU.docx
@@ -318,7 +318,7 @@
         <w:t xml:space="preserve"> </w:t>
       </w:r>
       <w:r>
-        <w:t xml:space="preserve">(innovation-driven so với resource-driven) và xác nhận khuôn mẫu</w:t>
+        <w:t xml:space="preserve">(đổi mới dẫn dắt so với tài nguyên dẫn dắt; innovation- vs. resource-driven) và xác nhận khuôn mẫu</w:t>
       </w:r>
       <w:r>
         <w:t xml:space="preserve"> </w:t>
@@ -894,7 +894,21 @@
               <w:jc w:val="left"/>
             </w:pPr>
             <w:r>
-              <w:t xml:space="preserve">Thay đổi theo thời gian: Δ điểm phần trăm 2018–2026 so với 2006–2012</w:t>
+              <w:t xml:space="preserve">Thay đổi theo thời gian:</w:t>
+            </w:r>
+            <w:r>
+              <w:t xml:space="preserve"> </w:t>
+            </w:r>
+            <m:oMath>
+              <m:r>
+                <m:t>Δ</m:t>
+              </m:r>
+            </m:oMath>
+            <w:r>
+              <w:t xml:space="preserve"> </w:t>
+            </w:r>
+            <w:r>
+              <w:t xml:space="preserve">điểm phần trăm 2018–2026 so với 2006–2012</w:t>
             </w:r>
           </w:p>
         </w:tc>
@@ -1421,7 +1435,18 @@
               <w:jc w:val="left"/>
             </w:pPr>
             <w:r>
-              <w:t xml:space="preserve">Slope chart 2006–2012 vs 2018–2026 (Δ điểm phần trăm theo nhóm ICRV)</w:t>
+              <w:t xml:space="preserve">Slope chart 2006–2012 vs 2018–2026 (</w:t>
+            </w:r>
+            <m:oMath>
+              <m:r>
+                <m:t>Δ</m:t>
+              </m:r>
+            </m:oMath>
+            <w:r>
+              <w:t xml:space="preserve"> </w:t>
+            </w:r>
+            <w:r>
+              <w:t xml:space="preserve">điểm phần trăm theo nhóm ICRV)</w:t>
             </w:r>
           </w:p>
         </w:tc>
@@ -2088,7 +2113,7 @@
               <w:jc w:val="left"/>
             </w:pPr>
             <w:r>
-              <w:t xml:space="preserve">DAI (Tier-1)</w:t>
+              <w:t xml:space="preserve">DAI (Bậc 1)</w:t>
             </w:r>
           </w:p>
         </w:tc>
@@ -2126,7 +2151,7 @@
               <w:jc w:val="left"/>
             </w:pPr>
             <w:r>
-              <w:t xml:space="preserve">DAI (Tier-2)</w:t>
+              <w:t xml:space="preserve">DAI (Bậc 2)</w:t>
             </w:r>
           </w:p>
         </w:tc>
@@ -3639,7 +3664,7 @@
         <w:pStyle w:val="BodyText"/>
       </w:pPr>
       <w:r>
-        <w:t xml:space="preserve">Bức tranh hiệu quả hoạt động kinh doanh của doanh nghiệp châu Á 2006–2026 được định hình bởi</w:t>
+        <w:t xml:space="preserve">Diện mạo hiệu quả hoạt động kinh doanh của doanh nghiệp châu Á 2006–2026 được định hình bởi</w:t>
       </w:r>
       <w:r>
         <w:t xml:space="preserve"> </w:t>
@@ -4240,7 +4265,7 @@
         <w:t xml:space="preserve"> </w:t>
       </w:r>
       <w:r>
-        <w:t xml:space="preserve">(19 năm khảo sát, 103 cặp nền kinh tế × năm). Ba thế hệ lược đồ WBES trong mẫu gộp mô tả: PICS3/tiền-Standardized (2006–2012, 18 đợt, n=8.048), Standardized (2013–2017, 27 đợt, n=23.940), BREADY/BEE/EAP Core (2018–2026, 57 đợt, n=54.713, chiếm 63,1% mẫu gộp).</w:t>
+        <w:t xml:space="preserve">(19 năm khảo sát, 103 cặp nền kinh tế × năm). Ba thế hệ lược đồ WBES trong mẫu gộp mô tả: PICS3/tiền-Standardized (2006–2012, 18 đợt, n=8.048), Standardized (2013–2017, 27 đợt, n=23.940), BREADY/BEE/EAP Core (2018–2026, 58 đợt, n=56.881, chiếm 64,0% mẫu gộp).</w:t>
       </w:r>
     </w:p>
     <w:bookmarkEnd w:id="28"/>
@@ -4285,10 +4310,10 @@
           <w:bCs/>
           <w:b/>
         </w:rPr>
-        <w:t xml:space="preserve">(2) Chỉ số áp dụng số bị giới hạn ở Tier-1 và Tier-2</w:t>
-      </w:r>
-      <w:r>
-        <w:t xml:space="preserve">: Bộ câu hỏi PICS3/Standardized chỉ có website nhị phân (Tier-1). BREADY có Tầng 2 nhưng không đo Tầng 3/4. Chuyên đề chỉ phát biểu về phần bù Tầng 1/2, không phải toàn bộ phổ áp dụng số.</w:t>
+        <w:t xml:space="preserve">(2) Chỉ số áp dụng số bị giới hạn ở Bậc 1 và Bậc 2</w:t>
+      </w:r>
+      <w:r>
+        <w:t xml:space="preserve">: Bộ câu hỏi PICS3/Standardized chỉ có website nhị phân (Bậc 1). BREADY có Bậc 2 nhưng không đo Bậc 3/4. Chuyên đề chỉ phát biểu về phần bù Bậc 1/2, không phải toàn bộ phổ áp dụng số.</w:t>
       </w:r>
     </w:p>
     <w:p>
@@ -4378,7 +4403,7 @@
         <w:t xml:space="preserve">(7) Không có dữ liệu cường độ số theo ngành</w:t>
       </w:r>
       <w:r>
-        <w:t xml:space="preserve">: WBES không phân biệt chỉ số áp dụng số theo ngành. Doanh nghiệp sản xuất và dịch vụ có hệ số DAI Tầng 1 giống nhau nhưng cường độ số thực tế khác nhau. Hiệu ứng cố định ngành kiểm soát được một phần nhưng không giải quyết triệt để vấn đề này.</w:t>
+        <w:t xml:space="preserve">: WBES không phân biệt chỉ số áp dụng số theo ngành. Doanh nghiệp sản xuất và dịch vụ có hệ số DAI Bậc 1 giống nhau nhưng cường độ số thực tế khác nhau. Hiệu ứng cố định ngành kiểm soát được một phần nhưng không giải quyết triệt để vấn đề này.</w:t>
       </w:r>
     </w:p>
     <w:bookmarkEnd w:id="29"/>
@@ -4418,7 +4443,7 @@
           <w:bCs/>
           <w:b/>
         </w:rPr>
-        <w:t xml:space="preserve">Bức tranh thực trạng đa chiều</w:t>
+        <w:t xml:space="preserve">Toàn cảnh thực trạng đa chiều</w:t>
       </w:r>
       <w:r>
         <w:t xml:space="preserve"> </w:t>
@@ -4445,7 +4470,7 @@
         <w:t xml:space="preserve"> </w:t>
       </w:r>
       <w:r>
-        <w:t xml:space="preserve">(innovation-driven so với resource-driven), phát hiện lý thuyết mới chưa có trong tài liệu hiện hành. Hai nhóm cùng mức thu nhập cao nhưng cấu trúc năng lực đối lập: R&amp;D 21,0% so với 7,0%; doanh nghiệp xuất khẩu 24,5% so với 11,7%; nữ quản lý cấp cao 20,7% so với 4,6%, phản ánh hai cơ chế tăng trưởng hoàn toàn khác nhau.</w:t>
+        <w:t xml:space="preserve">(đổi mới dẫn dắt so với tài nguyên dẫn dắt), phát hiện lý thuyết mới chưa có trong tài liệu hiện hành. Hai nhóm cùng mức thu nhập cao nhưng cấu trúc năng lực đối lập: R&amp;D 21,0% so với 7,0%; doanh nghiệp xuất khẩu 24,5% so với 11,7%; nữ quản lý cấp cao 20,7% so với 4,6%, phản ánh hai cơ chế tăng trưởng hoàn toàn khác nhau.</w:t>
       </w:r>
     </w:p>
     <w:p>
@@ -4466,7 +4491,7 @@
         <w:t xml:space="preserve"> </w:t>
       </w:r>
       <w:r>
-        <w:t xml:space="preserve">ở các nhóm đang nổi và chuyển đổi 2018–2026, mở rộng khuôn mẫu từ 17 nền lên 50 nền. Phân tách Tầng 1 (website nhị phân, tiệm cận bão hòa ở Advanced) và Tầng 2 (tổng hợp đa thành phần, đang phát triển ở các nhóm IV–VI).</w:t>
+        <w:t xml:space="preserve">ở các nhóm đang nổi và chuyển đổi 2018–2026, mở rộng khuôn mẫu từ 17 nền lên 50 nền. Phân tách Bậc 1 (website nhị phân, tiệm cận bão hòa ở Advanced) và Bậc 2 (tổng hợp đa thành phần, đang phát triển ở các nhóm IV–VI).</w:t>
       </w:r>
     </w:p>
     <w:p>
@@ -4911,7 +4936,7 @@
           <w:bCs/>
           <w:b/>
         </w:rPr>
-        <w:t xml:space="preserve">Tier-1 Sự hiện diện số cơ bản</w:t>
+        <w:t xml:space="preserve">Bậc 1 Sự hiện diện số cơ bản</w:t>
       </w:r>
       <w:r>
         <w:t xml:space="preserve">. Spec 2 (BREADY 2018+ trở lên): tổng hợp chuẩn hóa z website + cường độ thanh toán điện tử (k33/k38),</w:t>
@@ -4924,7 +4949,7 @@
           <w:bCs/>
           <w:b/>
         </w:rPr>
-        <w:t xml:space="preserve">Tier-2 Chuyển đổi số cơ bản</w:t>
+        <w:t xml:space="preserve">Bậc 2 Chuyển đổi số cơ bản</w:t>
       </w:r>
       <w:r>
         <w:t xml:space="preserve">. Phân tầng đo lường số hóa theo Verhoef et al. (2021); vai trò công cụ số trong quốc tế hóa theo Banalieva &amp; Dhanaraj (2019).</w:t>
@@ -5485,7 +5510,7 @@
         <w:t xml:space="preserve">Chiều 1, Năng suất lao động</w:t>
       </w:r>
       <w:r>
-        <w:t xml:space="preserve">. Biến đo lường chính: LP = ln(doanh thu hàng năm PPP / số lao động toàn thời gian). Đây là</w:t>
+        <w:t xml:space="preserve">. Biến đo lường chính: LP = ln(doanh thu hàng năm trong nội tệ / số lao động toàn thời gian), chuẩn hóa z trong từng cặp nền kinh tế × năm để bảo đảm so sánh được (xem Mục 2.3.1.1). Đây là</w:t>
       </w:r>
       <w:r>
         <w:t xml:space="preserve"> </w:t>
@@ -5546,7 +5571,7 @@
         <w:t xml:space="preserve">Chiều 4, Đổi mới sáng tạo và cấu trúc doanh nghiệp</w:t>
       </w:r>
       <w:r>
-        <w:t xml:space="preserve">. Biến đo lường: (a) R&amp;D (tỷ lệ doanh nghiệp có chi tiêu R&amp;D dương); (b) đổi mới sản phẩm mới; (c) đổi mới quy trình mới; (d) chứng nhận ISO; (e) website (Tier-1 Sự hiện diện số cơ bản); (f) FDI ≥10% (cơ cấu sở hữu). Chiều thứ tư phản ánh</w:t>
+        <w:t xml:space="preserve">. Biến đo lường: (a) R&amp;D (tỷ lệ doanh nghiệp có chi tiêu R&amp;D dương); (b) đổi mới sản phẩm mới; (c) đổi mới quy trình mới; (d) chứng nhận ISO; (e) website (Bậc 1 Sự hiện diện số cơ bản); (f) FDI ≥10% (cơ cấu sở hữu). Chiều thứ tư phản ánh</w:t>
       </w:r>
       <w:r>
         <w:t xml:space="preserve"> </w:t>
@@ -5602,13 +5627,13 @@
           <w:bCs/>
           <w:b/>
         </w:rPr>
-        <w:t xml:space="preserve">68 nghiên cứu</w:t>
-      </w:r>
-      <w:r>
-        <w:t xml:space="preserve"> </w:t>
-      </w:r>
-      <w:r>
-        <w:t xml:space="preserve">giai đoạn 1980–2005. Hệ số tương quan trung bình r=0,045, tích cực nhưng nhỏ. Phát hiện chính: đo lường quốc tế hóa và hiệu quả rất không đồng nhất giữa các nghiên cứu, hạn chế khả năng so sánh. Khoảng trống: ít nghiên cứu châu Á mới nổi.</w:t>
+        <w:t xml:space="preserve">36 nghiên cứu</w:t>
+      </w:r>
+      <w:r>
+        <w:t xml:space="preserve"> </w:t>
+      </w:r>
+      <w:r>
+        <w:t xml:space="preserve">(41 mẫu) giai đoạn 1980–2005. Hệ số tương quan trung bình dương nhưng nhỏ. Phát hiện chính: đo lường quốc tế hóa và hiệu quả rất không đồng nhất giữa các nghiên cứu, hạn chế khả năng so sánh. Khoảng trống: ít nghiên cứu châu Á mới nổi.</w:t>
       </w:r>
     </w:p>
     <w:p>
@@ -5633,13 +5658,13 @@
           <w:bCs/>
           <w:b/>
         </w:rPr>
-        <w:t xml:space="preserve">154 mẫu</w:t>
-      </w:r>
-      <w:r>
-        <w:t xml:space="preserve"> </w:t>
-      </w:r>
-      <w:r>
-        <w:t xml:space="preserve">với phân tích điều tiết phân tích tổng hợp. Phát hiện: quan hệ quốc tế hóa – hiệu quả dương và có ý nghĩa thống kê; nhưng bị điều tiết bởi loại doanh nghiệp, phương thức đo lường, bối cảnh quốc gia. Quan trọng: các doanh nghiệp châu Á và các nền kinh tế mới nổi biểu hiện khuôn mẫu khác biệt so với doanh nghiệp OECD.</w:t>
+        <w:t xml:space="preserve">152 mẫu</w:t>
+      </w:r>
+      <w:r>
+        <w:t xml:space="preserve"> </w:t>
+      </w:r>
+      <w:r>
+        <w:t xml:space="preserve">(141 nghiên cứu) với phân tích điều tiết phân tích tổng hợp. Phát hiện: quan hệ quốc tế hóa – hiệu quả dương và có ý nghĩa thống kê; nhưng bị điều tiết bởi loại doanh nghiệp, phương thức đo lường, bối cảnh quốc gia. Quan trọng: các doanh nghiệp châu Á và các nền kinh tế mới nổi biểu hiện khuôn mẫu khác biệt so với doanh nghiệp OECD.</w:t>
       </w:r>
     </w:p>
     <w:p>
@@ -5654,7 +5679,7 @@
         <w:t xml:space="preserve">(3) Marano et al. (2016)</w:t>
       </w:r>
       <w:r>
-        <w:t xml:space="preserve">: Tập trung vào thể chế hóa nghiên cứu quốc tế hóa – hiệu quả. Phát hiện: chất lượng thể chế nước chủ nhà là biến điều tiết quan trọng nhất, giải thích phần lớn phương sai không giải thích được trong các phân tích tổng hợp trước. Đặt nền tảng cho khung ICRV trong chuyên đề này.</w:t>
+        <w:t xml:space="preserve">: Tập trung vào thể chế hóa nghiên cứu quốc tế hóa – hiệu quả. Phát hiện: chất lượng thể chế nước chủ nhà là biến điều tiết quan trọng nhất, giải thích phần lớn phương sai không giải thích được trong các phân tích tổng hợp trước. Đặt nền tảng cho khung ICRV trong chuyên đề này. Bổ sung cho hướng này, Beugelsdijk et al. (2018), qua một phân tích tổng hợp về khoảng cách văn hóa và quá trình quốc tế hóa của doanh nghiệp, cho thấy hệ quả của quốc tế hóa thay đổi một cách hệ thống theo khoảng cách văn hóa và thể chế giữa thị trường nguồn và thị trường đích, củng cố nền tảng lý thuyết cho việc phân nhóm theo phổ thể chế ICRV sáu nhóm.</w:t>
       </w:r>
     </w:p>
     <w:p>
@@ -5681,7 +5706,7 @@
           <w:bCs/>
           <w:b/>
         </w:rPr>
-        <w:t xml:space="preserve">(5) Wu, Xu và Yang (2022)</w:t>
+        <w:t xml:space="preserve">(5) Wu, Wood và Khan (2022)</w:t>
       </w:r>
       <w:r>
         <w:t xml:space="preserve">: Cập nhật phân tích tổng hợp đến 2020, tập trung vào</w:t>
@@ -5712,7 +5737,7 @@
         <w:t xml:space="preserve">Khoảng trống từ 5 meta-analyses</w:t>
       </w:r>
       <w:r>
-        <w:t xml:space="preserve">: Không một phân tích tổng hợp nào trong số trên có dữ liệu WBES xuyên 50 nền kinh tế với phân loại ICRV 6 nhóm. Không có nghiên cứu nào phân biệt tường minh Tầng 1 và Tầng 2 áp dụng số như biến điều tiết riêng biệt. Khoảng trống này là nền tảng cho phần thảo luận về các khoảng trống nghiên cứu trong mục 2.3.9.</w:t>
+        <w:t xml:space="preserve">: Không một phân tích tổng hợp nào trong số trên có dữ liệu WBES xuyên 50 nền kinh tế với phân loại ICRV 6 nhóm. Không có nghiên cứu nào phân biệt tường minh Bậc 1 và Bậc 2 áp dụng số như biến điều tiết riêng biệt. Khoảng trống này là nền tảng cho phần thảo luận về các khoảng trống nghiên cứu trong mục 2.3.9.</w:t>
       </w:r>
     </w:p>
     <w:bookmarkEnd w:id="38"/>
@@ -5761,7 +5786,7 @@
         <w:t xml:space="preserve">lộ trình tiệm tiến</w:t>
       </w:r>
       <w:r>
-        <w:t xml:space="preserve">, bắt đầu từ các thị trường gần về tâm lý rồi mở rộng dần. Phiên bản 2009 cập nhật: mạng lưới quan hệ kinh doanh thay thế khoảng cách tâm lý như cơ chế dẫn dắt. Hàm ý cho chuyên đề: (a) khuôn mẫu FSTS thấp ở SIDS Pacific (6,3%) và FSTS cao liên kết FDI ở Việt Nam (23,2%) phù hợp với đường cong học hỏi Uppsala; (b) các công cụ số theo Banalieva &amp; Dhanaraj (2019) có thể rút ngắn lộ trình tiệm tiến ở giai đoạn đầu, nhưng cần Tầng 2 để phát huy đầy đủ.</w:t>
+        <w:t xml:space="preserve">, bắt đầu từ các thị trường gần về tâm lý rồi mở rộng dần. Phiên bản 2009 cập nhật: mạng lưới quan hệ kinh doanh thay thế khoảng cách tâm lý như cơ chế dẫn dắt. Hàm ý cho chuyên đề: (a) khuôn mẫu FSTS thấp ở SIDS Pacific (6,3%) và FSTS cao liên kết FDI ở Việt Nam (23,2%) phù hợp với đường cong học hỏi Uppsala; (b) các công cụ số theo Banalieva &amp; Dhanaraj (2019) có thể rút ngắn lộ trình tiệm tiến ở giai đoạn đầu, nhưng cần Bậc 2 để phát huy đầy đủ.</w:t>
       </w:r>
     </w:p>
     <w:p>
@@ -6288,7 +6313,7 @@
               <w:jc w:val="center"/>
             </w:pPr>
             <w:r>
-              <w:t xml:space="preserve">✗</w:t>
+              <w:t xml:space="preserve">Không</w:t>
             </w:r>
           </w:p>
         </w:tc>
@@ -6319,13 +6344,13 @@
       </w:tr>
     </w:tbl>
     <w:bookmarkEnd w:id="40"/>
-    <w:bookmarkStart w:id="41" w:name="X095aaec1a623b630743abb29fda2315c3c0a6ca"/>
+    <w:bookmarkStart w:id="41" w:name="X4ca83cf2abcff6a48f6b1f7c0413cca47df7dba"/>
     <w:p>
       <w:pPr>
         <w:pStyle w:val="Heading4"/>
       </w:pPr>
       <w:r>
-        <w:t xml:space="preserve">2.3.1.6 Khung 4 Tầng chuyển đổi số và Mô hình CDCM</w:t>
+        <w:t xml:space="preserve">2.3.1.6 Khung 4 Bậc chuyển đổi số và Mô hình CDCM</w:t>
       </w:r>
     </w:p>
     <w:p>
@@ -6337,7 +6362,7 @@
           <w:bCs/>
           <w:b/>
         </w:rPr>
-        <w:t xml:space="preserve">Bốn tầng bậc số hóa theo Verhoef et al. (2021)</w:t>
+        <w:t xml:space="preserve">Bốn bậc số hóa theo Verhoef et al. (2021)</w:t>
       </w:r>
       <w:r>
         <w:t xml:space="preserve">:</w:t>
@@ -6368,7 +6393,7 @@
               <w:jc w:val="left"/>
             </w:pPr>
             <w:r>
-              <w:t xml:space="preserve">Tầng</w:t>
+              <w:t xml:space="preserve">Bậc</w:t>
             </w:r>
           </w:p>
         </w:tc>
@@ -6422,7 +6447,7 @@
                 <w:bCs/>
                 <w:b/>
               </w:rPr>
-              <w:t xml:space="preserve">Tier 1</w:t>
+              <w:t xml:space="preserve">Bậc 1</w:t>
             </w:r>
           </w:p>
         </w:tc>
@@ -6476,7 +6501,7 @@
                 <w:bCs/>
                 <w:b/>
               </w:rPr>
-              <w:t xml:space="preserve">Tier 2</w:t>
+              <w:t xml:space="preserve">Bậc 2</w:t>
             </w:r>
           </w:p>
         </w:tc>
@@ -6530,7 +6555,7 @@
                 <w:bCs/>
                 <w:b/>
               </w:rPr>
-              <w:t xml:space="preserve">Tier 3</w:t>
+              <w:t xml:space="preserve">Bậc 3</w:t>
             </w:r>
           </w:p>
         </w:tc>
@@ -6584,7 +6609,7 @@
                 <w:bCs/>
                 <w:b/>
               </w:rPr>
-              <w:t xml:space="preserve">Tier 4</w:t>
+              <w:t xml:space="preserve">Bậc 4</w:t>
             </w:r>
           </w:p>
         </w:tc>
@@ -6638,7 +6663,7 @@
         <w:t xml:space="preserve">Tuyên bố ranh giới đo lường</w:t>
       </w:r>
       <w:r>
-        <w:t xml:space="preserve">: Dữ liệu WBES của chuyên đề (khung phân tích 88.869 DN / 50 nền, gồm Nhật Bản, dùng chung cho mô tả và ước lượng P7) quan sát Tầng 1–2, không Tầng 3–4. Mọi lập luận về</w:t>
+        <w:t xml:space="preserve">: Dữ liệu WBES của chuyên đề (khung phân tích 88.869 DN / 50 nền, gồm Nhật Bản, dùng chung cho mô tả và ước lượng P7) quan sát Bậc 1–2, không Bậc 3–4. Mọi lập luận về</w:t>
       </w:r>
       <w:r>
         <w:t xml:space="preserve"> </w:t>
@@ -6730,7 +6755,7 @@
         <w:t xml:space="preserve">(b) Cơ chế DAI</w:t>
       </w:r>
       <w:r>
-        <w:t xml:space="preserve">: Việt Nam (Tier 1 = website only) sang</w:t>
+        <w:t xml:space="preserve">: Việt Nam (Bậc 1 = website only) sang</w:t>
       </w:r>
       <w:r>
         <w:t xml:space="preserve"> </w:t>
@@ -6743,7 +6768,66 @@
         <w:t xml:space="preserve">phụ thuộc giai đoạn</w:t>
       </w:r>
       <w:r>
-        <w:t xml:space="preserve">: tương tác DAI×FSTS âm ở FSTS cao, Tầng 1 trở thành điểm nghẽn. Singapore (Tier 1+2) sang</w:t>
+        <w:t xml:space="preserve">: tương tác</w:t>
+      </w:r>
+      <w:r>
+        <w:t xml:space="preserve"> </w:t>
+      </w:r>
+      <m:oMath>
+        <m:r>
+          <m:rPr>
+            <m:sty m:val="p"/>
+          </m:rPr>
+          <m:t>D</m:t>
+        </m:r>
+        <m:r>
+          <m:rPr>
+            <m:sty m:val="p"/>
+          </m:rPr>
+          <m:t>A</m:t>
+        </m:r>
+        <m:r>
+          <m:rPr>
+            <m:sty m:val="p"/>
+          </m:rPr>
+          <m:t>I</m:t>
+        </m:r>
+        <m:r>
+          <m:rPr>
+            <m:sty m:val="p"/>
+          </m:rPr>
+          <m:t>×</m:t>
+        </m:r>
+        <m:r>
+          <m:rPr>
+            <m:sty m:val="p"/>
+          </m:rPr>
+          <m:t>F</m:t>
+        </m:r>
+        <m:r>
+          <m:rPr>
+            <m:sty m:val="p"/>
+          </m:rPr>
+          <m:t>S</m:t>
+        </m:r>
+        <m:r>
+          <m:rPr>
+            <m:sty m:val="p"/>
+          </m:rPr>
+          <m:t>T</m:t>
+        </m:r>
+        <m:r>
+          <m:rPr>
+            <m:sty m:val="p"/>
+          </m:rPr>
+          <m:t>S</m:t>
+        </m:r>
+      </m:oMath>
+      <w:r>
+        <w:t xml:space="preserve"> </w:t>
+      </w:r>
+      <w:r>
+        <w:t xml:space="preserve">âm ở FSTS cao, Bậc 1 trở thành điểm nghẽn. Singapore (Bậc 1+2) sang</w:t>
       </w:r>
       <w:r>
         <w:t xml:space="preserve"> </w:t>
@@ -6756,7 +6840,130 @@
         <w:t xml:space="preserve">mở rộng có điều kiện</w:t>
       </w:r>
       <w:r>
-        <w:t xml:space="preserve">: tương tác DAI×FSTS² dương mạnh (β=3,119, p=0,005), Tầng 1+2 là đòn bẩy.</w:t>
+        <w:t xml:space="preserve">: tương tác</w:t>
+      </w:r>
+      <w:r>
+        <w:t xml:space="preserve"> </w:t>
+      </w:r>
+      <m:oMath>
+        <m:r>
+          <m:rPr>
+            <m:sty m:val="p"/>
+          </m:rPr>
+          <m:t>D</m:t>
+        </m:r>
+        <m:r>
+          <m:rPr>
+            <m:sty m:val="p"/>
+          </m:rPr>
+          <m:t>A</m:t>
+        </m:r>
+        <m:r>
+          <m:rPr>
+            <m:sty m:val="p"/>
+          </m:rPr>
+          <m:t>I</m:t>
+        </m:r>
+        <m:r>
+          <m:rPr>
+            <m:sty m:val="p"/>
+          </m:rPr>
+          <m:t>×</m:t>
+        </m:r>
+        <m:sSup>
+          <m:e>
+            <m:r>
+              <m:rPr>
+                <m:sty m:val="p"/>
+              </m:rPr>
+              <m:t>F</m:t>
+            </m:r>
+            <m:r>
+              <m:rPr>
+                <m:sty m:val="p"/>
+              </m:rPr>
+              <m:t>S</m:t>
+            </m:r>
+            <m:r>
+              <m:rPr>
+                <m:sty m:val="p"/>
+              </m:rPr>
+              <m:t>T</m:t>
+            </m:r>
+            <m:r>
+              <m:rPr>
+                <m:sty m:val="p"/>
+              </m:rPr>
+              <m:t>S</m:t>
+            </m:r>
+          </m:e>
+          <m:sup>
+            <m:r>
+              <m:t>2</m:t>
+            </m:r>
+          </m:sup>
+        </m:sSup>
+      </m:oMath>
+      <w:r>
+        <w:t xml:space="preserve"> </w:t>
+      </w:r>
+      <w:r>
+        <w:t xml:space="preserve">dương mạnh (</w:t>
+      </w:r>
+      <m:oMath>
+        <m:r>
+          <m:t>β</m:t>
+        </m:r>
+        <m:r>
+          <m:rPr>
+            <m:sty m:val="p"/>
+          </m:rPr>
+          <m:t>=</m:t>
+        </m:r>
+        <m:r>
+          <m:t>3</m:t>
+        </m:r>
+        <m:r>
+          <m:rPr>
+            <m:sty m:val="p"/>
+          </m:rPr>
+          <m:t>,</m:t>
+        </m:r>
+        <m:r>
+          <m:t>119</m:t>
+        </m:r>
+      </m:oMath>
+      <w:r>
+        <w:t xml:space="preserve">,</w:t>
+      </w:r>
+      <w:r>
+        <w:t xml:space="preserve"> </w:t>
+      </w:r>
+      <m:oMath>
+        <m:r>
+          <m:t>p</m:t>
+        </m:r>
+        <m:r>
+          <m:rPr>
+            <m:sty m:val="p"/>
+          </m:rPr>
+          <m:t>=</m:t>
+        </m:r>
+        <m:r>
+          <m:t>0</m:t>
+        </m:r>
+        <m:r>
+          <m:rPr>
+            <m:sty m:val="p"/>
+          </m:rPr>
+          <m:t>,</m:t>
+        </m:r>
+        <m:r>
+          <m:t>005</m:t>
+        </m:r>
+      </m:oMath>
+      <w:r>
+        <w:t xml:space="preserve">), Bậc 1+2 là đòn bẩy.</w:t>
       </w:r>
     </w:p>
     <w:p>
@@ -6787,7 +6994,65 @@
         <w:t xml:space="preserve"> </w:t>
       </w:r>
       <w:r>
-        <w:t xml:space="preserve">(TCI z biến công cụ β=1,639, p&lt;0,001, ước lượng 2SLS vững). Singapore,</w:t>
+        <w:t xml:space="preserve">(TCI z biến công cụ</w:t>
+      </w:r>
+      <w:r>
+        <w:t xml:space="preserve"> </w:t>
+      </w:r>
+      <m:oMath>
+        <m:r>
+          <m:t>β</m:t>
+        </m:r>
+        <m:r>
+          <m:rPr>
+            <m:sty m:val="p"/>
+          </m:rPr>
+          <m:t>=</m:t>
+        </m:r>
+        <m:r>
+          <m:t>1</m:t>
+        </m:r>
+        <m:r>
+          <m:rPr>
+            <m:sty m:val="p"/>
+          </m:rPr>
+          <m:t>,</m:t>
+        </m:r>
+        <m:r>
+          <m:t>639</m:t>
+        </m:r>
+      </m:oMath>
+      <w:r>
+        <w:t xml:space="preserve">,</w:t>
+      </w:r>
+      <w:r>
+        <w:t xml:space="preserve"> </w:t>
+      </w:r>
+      <m:oMath>
+        <m:r>
+          <m:t>p</m:t>
+        </m:r>
+        <m:r>
+          <m:rPr>
+            <m:sty m:val="p"/>
+          </m:rPr>
+          <m:t>&lt;</m:t>
+        </m:r>
+        <m:r>
+          <m:t>0</m:t>
+        </m:r>
+        <m:r>
+          <m:rPr>
+            <m:sty m:val="p"/>
+          </m:rPr>
+          <m:t>,</m:t>
+        </m:r>
+        <m:r>
+          <m:t>001</m:t>
+        </m:r>
+      </m:oMath>
+      <w:r>
+        <w:t xml:space="preserve">, ước lượng 2SLS vững). Singapore,</w:t>
       </w:r>
       <w:r>
         <w:t xml:space="preserve"> </w:t>
@@ -8447,7 +8712,7 @@
           <w:iCs/>
           <w:i/>
         </w:rPr>
-        <w:t xml:space="preserve">Nguồn: Tổng hợp từ World Bank Enterprise Surveys (2025); WGI từ Kaufmann et al. (2011); GNI từ World Bank (2025, tháng 7). Cột sd log LP: trung vị độ lệch chuẩn ln(năng suất lao động) tính trong từng đợt khảo sát (Bảng 2.3.3.1). Khuôn mẫu quốc tế hóa – hiệu quả từ các nghiên cứu thành phần của luận án (Đỗ &amp; Phan, 2026, VEFR, JABS, JFAR, MIR).</w:t>
+        <w:t xml:space="preserve">Nguồn: Tổng hợp từ World Bank Enterprise Surveys (2025); WGI từ Kaufmann et al. (2011); GNI từ World Bank (2025, tháng 7). Cột sd log LP: trung vị độ lệch chuẩn ln(năng suất lao động) tính trong từng đợt khảo sát (Bảng 2.3.3.1). Khuôn mẫu quốc tế hóa – hiệu quả từ các nghiên cứu thành phần của luận án (Đỗ &amp; Phan, 2026, VEFR, JED, JFAR, MIR).</w:t>
       </w:r>
     </w:p>
     <w:p>
@@ -10016,7 +10281,7 @@
         <w:pStyle w:val="BodyText"/>
       </w:pPr>
       <w:r>
-        <w:t xml:space="preserve">Trung vị FSTS bằng 0%, phân phối phân cực mạnh với chỉ khoảng 12–28% doanh nghiệp tham gia xuất khẩu tùy theo nhóm (cao nhất ở Nhóm I, thấp nhất ở Nhóm II). SIDS có tốc độ tăng trưởng việc làm hàng năm kép cao nhất (5,3%), phản ánh quy mô nhỏ và tăng trưởng từ nền thấp. Nhóm I và V có FSTS trung bình cao nhất (13,4% và 10,6%) nhưng cơ chế xuất khẩu khác nhau: Nhóm I chủ yếu dịch vụ và hàng hóa hàm lượng tri thức cao; các nhóm III–V chủ yếu sản xuất theo chuỗi giá trị toàn cầu.</w:t>
+        <w:t xml:space="preserve">Trung vị FSTS bằng 0%, phân phối phân cực mạnh với chỉ khoảng 12–28% doanh nghiệp tham gia xuất khẩu tùy theo nhóm (cao nhất ở Nhóm I, thấp nhất ở Nhóm II). SIDS có tốc độ tăng trưởng việc làm hàng năm kép cao nhất (5,3%), phản ánh quy mô nhỏ và tăng trưởng từ nền thấp. Nhóm I và V có FSTS trung bình cao nhất (10,3% và 10,6%) nhưng cơ chế xuất khẩu khác nhau: Nhóm I chủ yếu dịch vụ và hàng hóa hàm lượng tri thức cao; các nhóm III–V chủ yếu sản xuất theo chuỗi giá trị toàn cầu.</w:t>
       </w:r>
     </w:p>
     <w:p>
@@ -11213,13 +11478,13 @@
       </w:r>
     </w:p>
     <w:bookmarkEnd w:id="62"/>
-    <w:bookmarkStart w:id="63" w:name="Xdbf03bfe856aa219791dbd3c40b9a33c42291cb"/>
+    <w:bookmarkStart w:id="63" w:name="Xaa05f2cc69387f8da77f0f5da9ec0329380f0a1"/>
     <w:p>
       <w:pPr>
         <w:pStyle w:val="Heading4"/>
       </w:pPr>
       <w:r>
-        <w:t xml:space="preserve">2.3.4.3 Tái định hình Chỉ số áp dụng số: Tầng 1 Sự hiện diện số cơ bản</w:t>
+        <w:t xml:space="preserve">2.3.4.3 Tái định hình Chỉ số áp dụng số: Bậc 1 Sự hiện diện số cơ bản</w:t>
       </w:r>
     </w:p>
     <w:p>
@@ -11268,7 +11533,7 @@
           <w:bCs/>
           <w:b/>
         </w:rPr>
-        <w:t xml:space="preserve">giới hạn của thước đo Tier-1</w:t>
+        <w:t xml:space="preserve">giới hạn của thước đo Bậc 1</w:t>
       </w:r>
       <w:r>
         <w:t xml:space="preserve"> </w:t>
@@ -11324,7 +11589,7 @@
           <w:bCs/>
           <w:b/>
         </w:rPr>
-        <w:t xml:space="preserve">Sự hiện diện số cơ bản (Tier-1)</w:t>
+        <w:t xml:space="preserve">Sự hiện diện số cơ bản (Bậc 1)</w:t>
       </w:r>
       <w:r>
         <w:rPr>
@@ -11392,7 +11657,7 @@
     <w:tbl>
       <w:tblPr>
         <w:tblStyle w:val="Table"/>
-        <w:tblW w:type="auto" w:w="0"/>
+        <w:tblW w:type="pct" w:w="5000"/>
         <w:tblLook w:firstRow="1" w:lastRow="0" w:firstColumn="0" w:lastColumn="0" w:noHBand="0" w:noVBand="0" w:val="0020"/>
         <w:jc w:val="start"/>
       </w:tblPr>
@@ -11450,7 +11715,24 @@
               <w:jc w:val="left"/>
             </w:pPr>
             <w:r>
-              <w:t xml:space="preserve">FDI ≥10%</w:t>
+              <w:t xml:space="preserve">FDI</w:t>
+            </w:r>
+            <w:r>
+              <w:t xml:space="preserve"> </w:t>
+            </w:r>
+            <m:oMath>
+              <m:r>
+                <m:rPr>
+                  <m:sty m:val="p"/>
+                </m:rPr>
+                <m:t>≥</m:t>
+              </m:r>
+            </m:oMath>
+            <w:r>
+              <w:t xml:space="preserve"> </w:t>
+            </w:r>
+            <w:r>
+              <w:t xml:space="preserve">10%</w:t>
             </w:r>
           </w:p>
         </w:tc>
@@ -12463,7 +12745,7 @@
     <w:tbl>
       <w:tblPr>
         <w:tblStyle w:val="Table"/>
-        <w:tblW w:type="auto" w:w="0"/>
+        <w:tblW w:type="pct" w:w="5000"/>
         <w:tblLook w:firstRow="1" w:lastRow="0" w:firstColumn="0" w:lastColumn="0" w:noHBand="0" w:noVBand="0" w:val="0020"/>
         <w:jc w:val="start"/>
       </w:tblPr>
@@ -12498,8 +12780,16 @@
               <w:pStyle w:val="Compact"/>
               <w:jc w:val="right"/>
             </w:pPr>
-            <w:r>
-              <w:t xml:space="preserve">Δ Website</w:t>
+            <m:oMath>
+              <m:r>
+                <m:t>Δ</m:t>
+              </m:r>
+            </m:oMath>
+            <w:r>
+              <w:t xml:space="preserve"> </w:t>
+            </w:r>
+            <w:r>
+              <w:t xml:space="preserve">Website</w:t>
             </w:r>
           </w:p>
         </w:tc>
@@ -12510,8 +12800,16 @@
               <w:pStyle w:val="Compact"/>
               <w:jc w:val="right"/>
             </w:pPr>
-            <w:r>
-              <w:t xml:space="preserve">Δ DN xuất khẩu</w:t>
+            <m:oMath>
+              <m:r>
+                <m:t>Δ</m:t>
+              </m:r>
+            </m:oMath>
+            <w:r>
+              <w:t xml:space="preserve"> </w:t>
+            </w:r>
+            <w:r>
+              <w:t xml:space="preserve">DN xuất khẩu</w:t>
             </w:r>
           </w:p>
         </w:tc>
@@ -12522,8 +12820,33 @@
               <w:pStyle w:val="Compact"/>
               <w:jc w:val="right"/>
             </w:pPr>
-            <w:r>
-              <w:t xml:space="preserve">Δ FDI ≥10%</w:t>
+            <m:oMath>
+              <m:r>
+                <m:t>Δ</m:t>
+              </m:r>
+            </m:oMath>
+            <w:r>
+              <w:t xml:space="preserve"> </w:t>
+            </w:r>
+            <w:r>
+              <w:t xml:space="preserve">FDI</w:t>
+            </w:r>
+            <w:r>
+              <w:t xml:space="preserve"> </w:t>
+            </w:r>
+            <m:oMath>
+              <m:r>
+                <m:rPr>
+                  <m:sty m:val="p"/>
+                </m:rPr>
+                <m:t>≥</m:t>
+              </m:r>
+            </m:oMath>
+            <w:r>
+              <w:t xml:space="preserve"> </w:t>
+            </w:r>
+            <w:r>
+              <w:t xml:space="preserve">10%</w:t>
             </w:r>
           </w:p>
         </w:tc>
@@ -12534,8 +12857,16 @@
               <w:pStyle w:val="Compact"/>
               <w:jc w:val="right"/>
             </w:pPr>
-            <w:r>
-              <w:t xml:space="preserve">Δ R&amp;D</w:t>
+            <m:oMath>
+              <m:r>
+                <m:t>Δ</m:t>
+              </m:r>
+            </m:oMath>
+            <w:r>
+              <w:t xml:space="preserve"> </w:t>
+            </w:r>
+            <w:r>
+              <w:t xml:space="preserve">R&amp;D</w:t>
             </w:r>
           </w:p>
         </w:tc>
@@ -12546,8 +12877,16 @@
               <w:pStyle w:val="Compact"/>
               <w:jc w:val="right"/>
             </w:pPr>
-            <w:r>
-              <w:t xml:space="preserve">Δ ISO</w:t>
+            <m:oMath>
+              <m:r>
+                <m:t>Δ</m:t>
+              </m:r>
+            </m:oMath>
+            <w:r>
+              <w:t xml:space="preserve"> </w:t>
+            </w:r>
+            <w:r>
+              <w:t xml:space="preserve">ISO</w:t>
             </w:r>
           </w:p>
         </w:tc>
@@ -14271,7 +14610,24 @@
               <w:jc w:val="right"/>
             </w:pPr>
             <w:r>
-              <w:t xml:space="preserve">FDI ≥10% (%)</w:t>
+              <w:t xml:space="preserve">FDI</w:t>
+            </w:r>
+            <w:r>
+              <w:t xml:space="preserve"> </w:t>
+            </w:r>
+            <m:oMath>
+              <m:r>
+                <m:rPr>
+                  <m:sty m:val="p"/>
+                </m:rPr>
+                <m:t>≥</m:t>
+              </m:r>
+            </m:oMath>
+            <w:r>
+              <w:t xml:space="preserve"> </w:t>
+            </w:r>
+            <w:r>
+              <w:t xml:space="preserve">10% (%)</w:t>
             </w:r>
           </w:p>
         </w:tc>
@@ -16741,7 +17097,7 @@
         <w:t xml:space="preserve"> </w:t>
       </w:r>
       <w:r>
-        <w:t xml:space="preserve">của nhóm Advanced đổi mới sáng tạo dẫn dắt. Theo nghiên cứu Singapore (Mar, Đỗ &amp; Phan, 2026, MIR đang phản biện): R² hiệu chỉnh = 0,196; tương tác FSTS² × DAI = 3,119 (p=0,005); điểm uốn ~88,6%.</w:t>
+        <w:t xml:space="preserve">của nhóm Advanced đổi mới sáng tạo dẫn dắt. Theo nghiên cứu Singapore (Mar, Đỗ &amp; Phan, 2026, mục tiêu MIR): R² hiệu chỉnh = 0,196; tương tác FSTS² × DAI = 3,119 (p=0,005); điểm uốn ~88,6%.</w:t>
       </w:r>
     </w:p>
     <w:p>
@@ -16796,7 +17152,7 @@
         <w:pStyle w:val="BodyText"/>
       </w:pPr>
       <w:r>
-        <w:t xml:space="preserve">Hệ sinh thái Singapore vận hành ở Tầng 3–4, vượt xa lớp DAI Tầng 1–2 đo trong WBES. Đây là lý do</w:t>
+        <w:t xml:space="preserve">Hệ sinh thái Singapore vận hành ở Bậc 3–4, vượt xa lớp DAI Bậc 1–2 đo trong WBES. Đây là lý do</w:t>
       </w:r>
       <w:r>
         <w:t xml:space="preserve"> </w:t>
@@ -16979,7 +17335,24 @@
               <w:jc w:val="left"/>
             </w:pPr>
             <w:r>
-              <w:t xml:space="preserve">FDI ≥10% (%)</w:t>
+              <w:t xml:space="preserve">FDI</w:t>
+            </w:r>
+            <w:r>
+              <w:t xml:space="preserve"> </w:t>
+            </w:r>
+            <m:oMath>
+              <m:r>
+                <m:rPr>
+                  <m:sty m:val="p"/>
+                </m:rPr>
+                <m:t>≥</m:t>
+              </m:r>
+            </m:oMath>
+            <w:r>
+              <w:t xml:space="preserve"> </w:t>
+            </w:r>
+            <w:r>
+              <w:t xml:space="preserve">10% (%)</w:t>
             </w:r>
           </w:p>
         </w:tc>
@@ -18043,7 +18416,24 @@
               <w:jc w:val="left"/>
             </w:pPr>
             <w:r>
-              <w:t xml:space="preserve">FDI ≥10% (%)</w:t>
+              <w:t xml:space="preserve">FDI</w:t>
+            </w:r>
+            <w:r>
+              <w:t xml:space="preserve"> </w:t>
+            </w:r>
+            <m:oMath>
+              <m:r>
+                <m:rPr>
+                  <m:sty m:val="p"/>
+                </m:rPr>
+                <m:t>≥</m:t>
+              </m:r>
+            </m:oMath>
+            <w:r>
+              <w:t xml:space="preserve"> </w:t>
+            </w:r>
+            <w:r>
+              <w:t xml:space="preserve">10% (%)</w:t>
             </w:r>
           </w:p>
         </w:tc>
@@ -18645,7 +19035,24 @@
               <w:jc w:val="left"/>
             </w:pPr>
             <w:r>
-              <w:t xml:space="preserve">FDI ≥ 10%</w:t>
+              <w:t xml:space="preserve">FDI</w:t>
+            </w:r>
+            <w:r>
+              <w:t xml:space="preserve"> </w:t>
+            </w:r>
+            <m:oMath>
+              <m:r>
+                <m:rPr>
+                  <m:sty m:val="p"/>
+                </m:rPr>
+                <m:t>≥</m:t>
+              </m:r>
+            </m:oMath>
+            <w:r>
+              <w:t xml:space="preserve"> </w:t>
+            </w:r>
+            <w:r>
+              <w:t xml:space="preserve">10%</w:t>
             </w:r>
           </w:p>
         </w:tc>
@@ -19101,7 +19508,7 @@
         <w:t xml:space="preserve"> </w:t>
       </w:r>
       <w:r>
-        <w:t xml:space="preserve">trong khi cao nhất ở II và IV (+0,202; +0,183), phần bù của hiện diện số Tầng 1 co lại nơi nó đã tiệm cận bão hòa (Nghịch lý bão hòa số ở dạng suy giảm lợi suất biên); (6)</w:t>
+        <w:t xml:space="preserve">trong khi cao nhất ở II và IV (+0,202; +0,183), phần bù của hiện diện số Bậc 1 co lại nơi nó đã tiệm cận bão hòa (Nghịch lý bão hòa số ở dạng suy giảm lợi suất biên); (6)</w:t>
       </w:r>
       <w:r>
         <w:t xml:space="preserve"> </w:t>
@@ -19612,7 +20019,7 @@
         <w:t xml:space="preserve"> </w:t>
       </w:r>
       <w:r>
-        <w:t xml:space="preserve">(năm 1–3): Sụt giảm ngắn hạn do chi phí thiết bị, đào tạo và gián đoạn quy trình. Bằng chứng gián tiếp: phần bù tương quan DAI thấp nhất tại Nhóm Advanced đổi mới (+0,093 so với +0,183–0,202 ở các nhóm chuyển đổi/tài nguyên), nơi Tầng 1 đã tiệm cận bão hòa, lợi suất biên co lại; giai đoạn</w:t>
+        <w:t xml:space="preserve">(năm 1–3): Sụt giảm ngắn hạn do chi phí thiết bị, đào tạo và gián đoạn quy trình. Bằng chứng gián tiếp: phần bù tương quan DAI thấp nhất tại Nhóm Advanced đổi mới (+0,093 so với +0,183–0,202 ở các nhóm chuyển đổi/tài nguyên), nơi Bậc 1 đã tiệm cận bão hòa, lợi suất biên co lại; giai đoạn</w:t>
       </w:r>
       <w:r>
         <w:t xml:space="preserve"> </w:t>
@@ -19666,7 +20073,125 @@
         <w:t xml:space="preserve"> </w:t>
       </w:r>
       <w:r>
-        <w:t xml:space="preserve">(năm 5+): Phần bù năng suất. Bằng chứng: Trung Quốc R&amp;D 39,4% (Tier-2 mature); FSTS²×DAI = +3,119 (p = 0,005) tại Singapore, DAI khuếch đại quan hệ quốc tế hóa – hiệu quả tại doanh nghiệp FSTS cao.</w:t>
+        <w:t xml:space="preserve">(năm 5+): Phần bù năng suất. Bằng chứng: Trung Quốc R&amp;D 39,4% (Bậc 2 mature);</w:t>
+      </w:r>
+      <w:r>
+        <w:t xml:space="preserve"> </w:t>
+      </w:r>
+      <m:oMath>
+        <m:sSup>
+          <m:e>
+            <m:r>
+              <m:rPr>
+                <m:sty m:val="p"/>
+              </m:rPr>
+              <m:t>F</m:t>
+            </m:r>
+            <m:r>
+              <m:rPr>
+                <m:sty m:val="p"/>
+              </m:rPr>
+              <m:t>S</m:t>
+            </m:r>
+            <m:r>
+              <m:rPr>
+                <m:sty m:val="p"/>
+              </m:rPr>
+              <m:t>T</m:t>
+            </m:r>
+            <m:r>
+              <m:rPr>
+                <m:sty m:val="p"/>
+              </m:rPr>
+              <m:t>S</m:t>
+            </m:r>
+          </m:e>
+          <m:sup>
+            <m:r>
+              <m:t>2</m:t>
+            </m:r>
+          </m:sup>
+        </m:sSup>
+        <m:r>
+          <m:rPr>
+            <m:sty m:val="p"/>
+          </m:rPr>
+          <m:t>×</m:t>
+        </m:r>
+        <m:r>
+          <m:rPr>
+            <m:sty m:val="p"/>
+          </m:rPr>
+          <m:t>D</m:t>
+        </m:r>
+        <m:r>
+          <m:rPr>
+            <m:sty m:val="p"/>
+          </m:rPr>
+          <m:t>A</m:t>
+        </m:r>
+        <m:r>
+          <m:rPr>
+            <m:sty m:val="p"/>
+          </m:rPr>
+          <m:t>I</m:t>
+        </m:r>
+        <m:r>
+          <m:rPr>
+            <m:sty m:val="p"/>
+          </m:rPr>
+          <m:t>=</m:t>
+        </m:r>
+        <m:r>
+          <m:rPr>
+            <m:sty m:val="p"/>
+          </m:rPr>
+          <m:t>+</m:t>
+        </m:r>
+        <m:r>
+          <m:t>3</m:t>
+        </m:r>
+        <m:r>
+          <m:rPr>
+            <m:sty m:val="p"/>
+          </m:rPr>
+          <m:t>,</m:t>
+        </m:r>
+        <m:r>
+          <m:t>119</m:t>
+        </m:r>
+      </m:oMath>
+      <w:r>
+        <w:t xml:space="preserve"> </w:t>
+      </w:r>
+      <w:r>
+        <w:t xml:space="preserve">(</w:t>
+      </w:r>
+      <m:oMath>
+        <m:r>
+          <m:t>p</m:t>
+        </m:r>
+        <m:r>
+          <m:rPr>
+            <m:sty m:val="p"/>
+          </m:rPr>
+          <m:t>=</m:t>
+        </m:r>
+        <m:r>
+          <m:t>0</m:t>
+        </m:r>
+        <m:r>
+          <m:rPr>
+            <m:sty m:val="p"/>
+          </m:rPr>
+          <m:t>,</m:t>
+        </m:r>
+        <m:r>
+          <m:t>005</m:t>
+        </m:r>
+      </m:oMath>
+      <w:r>
+        <w:t xml:space="preserve">) tại Singapore, DAI khuếch đại quan hệ quốc tế hóa – hiệu quả tại doanh nghiệp FSTS cao.</w:t>
       </w:r>
     </w:p>
     <w:p>
@@ -19681,7 +20206,7 @@
         <w:t xml:space="preserve">Liên kết CDCM</w:t>
       </w:r>
       <w:r>
-        <w:t xml:space="preserve">: Giai đoạn 1 = proxy cơ chế lỗi thời (DAI Tier-1 bão hòa); Giai đoạn 3 = cơ chế phụ thuộc giai đoạn (DAI Tier-2 có phần bù có điều kiện). Hai cơ chế bổ sung nhau khi kiểm soát thế hệ số.</w:t>
+        <w:t xml:space="preserve">: Giai đoạn 1 = proxy cơ chế lỗi thời (DAI Bậc 1 bão hòa); Giai đoạn 3 = cơ chế phụ thuộc giai đoạn (DAI Bậc 2 có phần bù có điều kiện). Hai cơ chế bổ sung nhau khi kiểm soát thế hệ số.</w:t>
       </w:r>
     </w:p>
     <w:p>
@@ -19840,7 +20365,7 @@
           <w:bCs/>
           <w:b/>
         </w:rPr>
-        <w:t xml:space="preserve">Tier-1 Sự hiện diện số cơ bản</w:t>
+        <w:t xml:space="preserve">Bậc 1 Sự hiện diện số cơ bản</w:t>
       </w:r>
       <w:r>
         <w:t xml:space="preserve"> </w:t>
@@ -19856,13 +20381,13 @@
           <w:bCs/>
           <w:b/>
         </w:rPr>
-        <w:t xml:space="preserve">Tier-2 Chuyển đổi số cơ bản</w:t>
-      </w:r>
-      <w:r>
-        <w:t xml:space="preserve"> </w:t>
-      </w:r>
-      <w:r>
-        <w:t xml:space="preserve">(đang phát triển). Phần bù tương quan DAI thấp nhất ở Nhóm I (+0,093) là dấu hiệu bão hòa Tầng 1, xem kiểm định loại trừ ICT tại Mục 2.3.4.3.</w:t>
+        <w:t xml:space="preserve">Bậc 2 Chuyển đổi số cơ bản</w:t>
+      </w:r>
+      <w:r>
+        <w:t xml:space="preserve"> </w:t>
+      </w:r>
+      <w:r>
+        <w:t xml:space="preserve">(đang phát triển). Phần bù tương quan DAI thấp nhất ở Nhóm I (+0,093) là dấu hiệu bão hòa Bậc 1, xem kiểm định loại trừ ICT tại Mục 2.3.4.3.</w:t>
       </w:r>
     </w:p>
     <w:p>
@@ -19877,7 +20402,7 @@
         <w:t xml:space="preserve">(vii) Khuôn mẫu phi tuyến FDI ≥10%</w:t>
       </w:r>
       <w:r>
-        <w:t xml:space="preserve">, dạng chữ U với cực tiểu ở Nhóm IV (3,1%): Advanced 10,6–13,6% sang Nhóm IV 3,1% sang SIDS 20,0%. Hai mô hình FDI: MNE hub (Advanced) và du lịch/viễn thông (SIDS).</w:t>
+        <w:t xml:space="preserve">, dạng chữ U với cực tiểu ở Nhóm IV (3,1%): Advanced 7,7–13,6% sang Nhóm IV 3,1% sang SIDS 20,0%. Hai mô hình FDI: MNE hub (Advanced) và du lịch/viễn thông (SIDS).</w:t>
       </w:r>
     </w:p>
     <w:p>
@@ -19959,7 +20484,7 @@
           <w:bCs/>
           <w:b/>
         </w:rPr>
-        <w:t xml:space="preserve">KT2, Phân nhóm con Advanced: innovation-driven so với resource-driven chưa được hệ thống hóa</w:t>
+        <w:t xml:space="preserve">KT2, Phân nhóm con Advanced: đổi mới dẫn dắt so với tài nguyên dẫn dắt chưa được hệ thống hóa</w:t>
       </w:r>
       <w:r>
         <w:t xml:space="preserve">: Nghiên cứu hiện hành (Bausch &amp; Krist, 2007; Kirca et al., 2012) gộp tất cả OECD vào</w:t>
@@ -19992,7 +20517,7 @@
         <w:t xml:space="preserve">KT3, Xác nhận nhân quả Nghịch lý bão hòa số qua ước lượng biến công cụ</w:t>
       </w:r>
       <w:r>
-        <w:t xml:space="preserve">: Phần bù tương quan DAI suy giảm rõ ở Advanced (+0,093, thấp nhất sáu nhóm) có thể phản ánh: (a) bão hòa thực sự của Tầng 1; (b) nhân quả ngược; (c) bias biến bỏ sót. Biến công cụ hợp lệ (độ phủ băng thông rộng) cần thiết để phân biệt.</w:t>
+        <w:t xml:space="preserve">: Phần bù tương quan DAI suy giảm rõ ở Advanced (+0,093, thấp nhất sáu nhóm) có thể phản ánh: (a) bão hòa thực sự của Bậc 1; (b) nhân quả ngược; (c) bias biến bỏ sót. Biến công cụ hợp lệ (độ phủ băng thông rộng) cần thiết để phân biệt.</w:t>
       </w:r>
     </w:p>
     <w:p>
@@ -20191,7 +20716,7 @@
               <w:jc w:val="left"/>
             </w:pPr>
             <w:r>
-              <w:t xml:space="preserve">Cơ chế innovation-driven và resource-driven khác nhau ra sao trong chuyển hóa quốc tế hóa thành hiệu quả?</w:t>
+              <w:t xml:space="preserve">Cơ chế đổi mới dẫn dắt và tài nguyên dẫn dắt khác nhau ra sao trong chuyển hóa quốc tế hóa thành hiệu quả?</w:t>
             </w:r>
           </w:p>
         </w:tc>
@@ -20353,7 +20878,7 @@
           <w:iCs/>
           <w:i/>
         </w:rPr>
-        <w:t xml:space="preserve">Ghi chú: Bảng này bảo đảm mỗi khoảng trống thực nghiệm rút ra từ bức tranh thực trạng được chuyển thành một câu hỏi nghiên cứu có thiết kế kiểm định cụ thể trong Chuyên đề 2, duy trì tính liên tục logic giữa hai chuyên đề.</w:t>
+        <w:t xml:space="preserve">Ghi chú: Bảng này bảo đảm mỗi khoảng trống thực nghiệm rút ra từ thực trạng được chuyển thành một câu hỏi nghiên cứu có thiết kế kiểm định cụ thể trong Chuyên đề 2, duy trì tính liên tục logic giữa hai chuyên đề.</w:t>
       </w:r>
     </w:p>
     <w:bookmarkEnd w:id="100"/>
@@ -20426,7 +20951,99 @@
         <w:t xml:space="preserve">(3) Giao diện Đổi mới-Hiệu suất Nâng cao (AIPI)</w:t>
       </w:r>
       <w:r>
-        <w:t xml:space="preserve">: FSTS²×DAI = +3,119 tại Singapore gợi ý cơ chế mới, tại FSTS cao, doanh nghiệp cần DAI như</w:t>
+        <w:t xml:space="preserve">:</w:t>
+      </w:r>
+      <w:r>
+        <w:t xml:space="preserve"> </w:t>
+      </w:r>
+      <m:oMath>
+        <m:sSup>
+          <m:e>
+            <m:r>
+              <m:rPr>
+                <m:sty m:val="p"/>
+              </m:rPr>
+              <m:t>F</m:t>
+            </m:r>
+            <m:r>
+              <m:rPr>
+                <m:sty m:val="p"/>
+              </m:rPr>
+              <m:t>S</m:t>
+            </m:r>
+            <m:r>
+              <m:rPr>
+                <m:sty m:val="p"/>
+              </m:rPr>
+              <m:t>T</m:t>
+            </m:r>
+            <m:r>
+              <m:rPr>
+                <m:sty m:val="p"/>
+              </m:rPr>
+              <m:t>S</m:t>
+            </m:r>
+          </m:e>
+          <m:sup>
+            <m:r>
+              <m:t>2</m:t>
+            </m:r>
+          </m:sup>
+        </m:sSup>
+        <m:r>
+          <m:rPr>
+            <m:sty m:val="p"/>
+          </m:rPr>
+          <m:t>×</m:t>
+        </m:r>
+        <m:r>
+          <m:rPr>
+            <m:sty m:val="p"/>
+          </m:rPr>
+          <m:t>D</m:t>
+        </m:r>
+        <m:r>
+          <m:rPr>
+            <m:sty m:val="p"/>
+          </m:rPr>
+          <m:t>A</m:t>
+        </m:r>
+        <m:r>
+          <m:rPr>
+            <m:sty m:val="p"/>
+          </m:rPr>
+          <m:t>I</m:t>
+        </m:r>
+        <m:r>
+          <m:rPr>
+            <m:sty m:val="p"/>
+          </m:rPr>
+          <m:t>=</m:t>
+        </m:r>
+        <m:r>
+          <m:rPr>
+            <m:sty m:val="p"/>
+          </m:rPr>
+          <m:t>+</m:t>
+        </m:r>
+        <m:r>
+          <m:t>3</m:t>
+        </m:r>
+        <m:r>
+          <m:rPr>
+            <m:sty m:val="p"/>
+          </m:rPr>
+          <m:t>,</m:t>
+        </m:r>
+        <m:r>
+          <m:t>119</m:t>
+        </m:r>
+      </m:oMath>
+      <w:r>
+        <w:t xml:space="preserve"> </w:t>
+      </w:r>
+      <w:r>
+        <w:t xml:space="preserve">tại Singapore gợi ý cơ chế mới, tại FSTS cao, doanh nghiệp cần DAI như</w:t>
       </w:r>
       <w:r>
         <w:t xml:space="preserve"> </w:t>
@@ -20459,7 +21076,7 @@
         <w:t xml:space="preserve">(4) Sân khấu số là thực tế đo lường ở cả hai chiều</w:t>
       </w:r>
       <w:r>
-        <w:t xml:space="preserve">: Tại Advanced, DAI Tầng 1 là yếu tố vệ sinh bão hòa. Tại Emerging, DAI Tầng 1 có thể là proxy lỗi thời, đo lường không còn phản ánh được cơ chế kinh tế thực.</w:t>
+        <w:t xml:space="preserve">: Tại Advanced, DAI Bậc 1 là yếu tố vệ sinh bão hòa. Tại Emerging, DAI Bậc 1 có thể là proxy lỗi thời, đo lường không còn phản ánh được cơ chế kinh tế thực.</w:t>
       </w:r>
     </w:p>
     <w:p>
@@ -20640,7 +21257,7 @@
         <w:t xml:space="preserve">KL3, Nghịch lý bão hòa số là cơ chế đo lường, không phải thất bại thị trường</w:t>
       </w:r>
       <w:r>
-        <w:t xml:space="preserve">: Phần bù DAI thấp nhất tại Advanced là hệ quả của đo lường Tầng 1 trong bối cảnh Tầng 2/3 đã được áp dụng rộng.</w:t>
+        <w:t xml:space="preserve">: Phần bù DAI thấp nhất tại Advanced là hệ quả của đo lường Bậc 1 trong bối cảnh Bậc 2/3 đã được áp dụng rộng.</w:t>
       </w:r>
     </w:p>
     <w:p>
@@ -20779,10 +21396,10 @@
           <w:bCs/>
           <w:b/>
         </w:rPr>
-        <w:t xml:space="preserve">(2) Ưu tiên Tier-2 số cho SME Việt Nam</w:t>
-      </w:r>
-      <w:r>
-        <w:t xml:space="preserve">: Website 47% là điểm đầu vào; VietQR, TikTok Shop, Shopee Asia Pacific là Tầng 1.5/Tầng 2 thực tế hơn. Voucher AI Adoption (~50 triệu VND/doanh nghiệp) giúp vượt qua giai đoạn đầu tư ban đầu.</w:t>
+        <w:t xml:space="preserve">(2) Ưu tiên Bậc 2 số cho SME Việt Nam</w:t>
+      </w:r>
+      <w:r>
+        <w:t xml:space="preserve">: Website 47% là điểm đầu vào; VietQR, TikTok Shop, Shopee Asia Pacific là Bậc 1.5/Bậc 2 thực tế hơn. Voucher AI Adoption (~50 triệu VND/doanh nghiệp) giúp vượt qua giai đoạn đầu tư ban đầu.</w:t>
       </w:r>
     </w:p>
     <w:p>
@@ -20842,7 +21459,7 @@
         <w:t xml:space="preserve">(6) Chính sách số hóa phân cấp theo vùng và quy mô</w:t>
       </w:r>
       <w:r>
-        <w:t xml:space="preserve">: Hiệu ứng DAI phụ thuộc bối cảnh, đầu tư website khác nhau tại TP.HCM (Tier-1.5) so với nông thôn đồng bằng sông Cửu Long (Tier-1 chưa bão hòa).</w:t>
+        <w:t xml:space="preserve">: Hiệu ứng DAI phụ thuộc bối cảnh, đầu tư website khác nhau tại TP.HCM (Bậc 1.5) so với nông thôn đồng bằng sông Cửu Long (Bậc 1 chưa bão hòa).</w:t>
       </w:r>
     </w:p>
     <w:p>
@@ -20954,13 +21571,13 @@
         <w:t xml:space="preserve"> </w:t>
       </w:r>
       <w:r>
-        <w:t xml:space="preserve">(a) Singapore/Hàn Quốc AI full-stack (Tier-3), không phù hợp để sao chép trực tiếp;</w:t>
-      </w:r>
-      <w:r>
-        <w:t xml:space="preserve"> </w:t>
-      </w:r>
-      <w:r>
-        <w:t xml:space="preserve">(b) Nhật Bản 60% doanh nghiệp AI back-office (Tier-2),</w:t>
+        <w:t xml:space="preserve">(a) Singapore/Hàn Quốc AI full-stack (Bậc 3), không phù hợp để sao chép trực tiếp;</w:t>
+      </w:r>
+      <w:r>
+        <w:t xml:space="preserve"> </w:t>
+      </w:r>
+      <w:r>
+        <w:t xml:space="preserve">(b) Nhật Bản 60% doanh nghiệp AI back-office (Bậc 2),</w:t>
       </w:r>
       <w:r>
         <w:t xml:space="preserve"> </w:t>
@@ -20979,7 +21596,7 @@
         <w:t xml:space="preserve"> </w:t>
       </w:r>
       <w:r>
-        <w:t xml:space="preserve">(c) Trung Quốc sản xuất thông minh (Tier-2/3), học điểm tích cực, tránh rủi ro tập trung;</w:t>
+        <w:t xml:space="preserve">(c) Trung Quốc sản xuất thông minh (Bậc 2/3), học điểm tích cực, tránh rủi ro tập trung;</w:t>
       </w:r>
       <w:r>
         <w:t xml:space="preserve"> </w:t>
@@ -20995,7 +21612,7 @@
           <w:bCs/>
           <w:b/>
         </w:rPr>
-        <w:t xml:space="preserve">Mô hình ưu tiên Việt Nam Tier-1.5</w:t>
+        <w:t xml:space="preserve">Mô hình ưu tiên Việt Nam Bậc 1.5</w:t>
       </w:r>
       <w:r>
         <w:t xml:space="preserve">: VietQR (100% miễn phí) sang Thương mại xã hội sang Xuyên biên giới Shopee/Amazon sang Cloud và AI cơ bản.</w:t>
@@ -21388,7 +22005,7 @@
         <w:pStyle w:val="BodyText"/>
       </w:pPr>
       <w:r>
-        <w:t xml:space="preserve">Briguglio, L. (1995). Small island developing states and their economic vulnerabilities.</w:t>
+        <w:t xml:space="preserve">Beugelsdijk, S., Kostova, T., Kunst, V. E., Spadafora, E., &amp; van Essen, M. (2018). Cultural distance and firm internationalization: A meta-analytical review and theoretical implications.</w:t>
       </w:r>
       <w:r>
         <w:t xml:space="preserve"> </w:t>
@@ -21398,10 +22015,10 @@
           <w:iCs/>
           <w:i/>
         </w:rPr>
-        <w:t xml:space="preserve">World Development, 23</w:t>
-      </w:r>
-      <w:r>
-        <w:t xml:space="preserve">(9), 1615–1632.</w:t>
+        <w:t xml:space="preserve">Journal of Management, 44</w:t>
+      </w:r>
+      <w:r>
+        <w:t xml:space="preserve">(1), 89–130. https://doi.org/10.1177/0149206317729027</w:t>
       </w:r>
     </w:p>
     <w:p>
@@ -21409,7 +22026,7 @@
         <w:pStyle w:val="BodyText"/>
       </w:pPr>
       <w:r>
-        <w:t xml:space="preserve">Brynjolfsson, E., &amp; McAfee, A. (2014).</w:t>
+        <w:t xml:space="preserve">Briguglio, L. (1995). Small island developing states and their economic vulnerabilities.</w:t>
       </w:r>
       <w:r>
         <w:t xml:space="preserve"> </w:t>
@@ -21419,10 +22036,10 @@
           <w:iCs/>
           <w:i/>
         </w:rPr>
-        <w:t xml:space="preserve">The second machine age: Work, progress, and prosperity in a time of brilliant technologies</w:t>
-      </w:r>
-      <w:r>
-        <w:t xml:space="preserve">. W. W. Norton &amp; Company.</w:t>
+        <w:t xml:space="preserve">World Development, 23</w:t>
+      </w:r>
+      <w:r>
+        <w:t xml:space="preserve">(9), 1615–1632.</w:t>
       </w:r>
     </w:p>
     <w:p>
@@ -21430,7 +22047,7 @@
         <w:pStyle w:val="BodyText"/>
       </w:pPr>
       <w:r>
-        <w:t xml:space="preserve">Cohen, W. M., &amp; Levinthal, D. A. (1990). Absorptive capacity: A new perspective on learning and innovation.</w:t>
+        <w:t xml:space="preserve">Brynjolfsson, E., &amp; McAfee, A. (2014).</w:t>
       </w:r>
       <w:r>
         <w:t xml:space="preserve"> </w:t>
@@ -21440,10 +22057,10 @@
           <w:iCs/>
           <w:i/>
         </w:rPr>
-        <w:t xml:space="preserve">Administrative Science Quarterly, 35</w:t>
-      </w:r>
-      <w:r>
-        <w:t xml:space="preserve">(1), 128–152.</w:t>
+        <w:t xml:space="preserve">The second machine age: Work, progress, and prosperity in a time of brilliant technologies</w:t>
+      </w:r>
+      <w:r>
+        <w:t xml:space="preserve">. W. W. Norton &amp; Company.</w:t>
       </w:r>
     </w:p>
     <w:p>
@@ -21451,7 +22068,7 @@
         <w:pStyle w:val="BodyText"/>
       </w:pPr>
       <w:r>
-        <w:t xml:space="preserve">Coltman, T., Devinney, T. M., Midgley, D. F., &amp; Venaik, S. (2008). Formative versus reflective measurement models: Two applications of formative measurement.</w:t>
+        <w:t xml:space="preserve">Cohen, W. M., &amp; Levinthal, D. A. (1990). Absorptive capacity: A new perspective on learning and innovation.</w:t>
       </w:r>
       <w:r>
         <w:t xml:space="preserve"> </w:t>
@@ -21461,10 +22078,10 @@
           <w:iCs/>
           <w:i/>
         </w:rPr>
-        <w:t xml:space="preserve">Journal of Business Research, 61</w:t>
-      </w:r>
-      <w:r>
-        <w:t xml:space="preserve">(12), 1250–1262. https://doi.org/10.1016/j.jbusres.2008.01.013</w:t>
+        <w:t xml:space="preserve">Administrative Science Quarterly, 35</w:t>
+      </w:r>
+      <w:r>
+        <w:t xml:space="preserve">(1), 128–152.</w:t>
       </w:r>
     </w:p>
     <w:p>
@@ -21472,7 +22089,7 @@
         <w:pStyle w:val="BodyText"/>
       </w:pPr>
       <w:r>
-        <w:t xml:space="preserve">Combs, J. G., Crook, T. R., &amp; Shook, C. L. (2005). The dimensionality of organizational performance and its implications for strategic management research. In D. J. Ketchen &amp; D. D. Bergh (Eds.),</w:t>
+        <w:t xml:space="preserve">Coltman, T., Devinney, T. M., Midgley, D. F., &amp; Venaik, S. (2008). Formative versus reflective measurement models: Two applications of formative measurement.</w:t>
       </w:r>
       <w:r>
         <w:t xml:space="preserve"> </w:t>
@@ -21482,13 +22099,10 @@
           <w:iCs/>
           <w:i/>
         </w:rPr>
-        <w:t xml:space="preserve">Research methodology in strategy and management</w:t>
-      </w:r>
-      <w:r>
-        <w:t xml:space="preserve"> </w:t>
-      </w:r>
-      <w:r>
-        <w:t xml:space="preserve">(Vol. 2, pp. 259–286). Emerald. https://doi.org/10.1016/S1479-8387(05)02011-4</w:t>
+        <w:t xml:space="preserve">Journal of Business Research, 61</w:t>
+      </w:r>
+      <w:r>
+        <w:t xml:space="preserve">(12), 1250–1262. https://doi.org/10.1016/j.jbusres.2008.01.013</w:t>
       </w:r>
     </w:p>
     <w:p>
@@ -21496,7 +22110,7 @@
         <w:pStyle w:val="BodyText"/>
       </w:pPr>
       <w:r>
-        <w:t xml:space="preserve">Contractor, F. J., Kundu, S. K., &amp; Hsu, C. C. (2003). A three-stage theory of international expansion.</w:t>
+        <w:t xml:space="preserve">Combs, J. G., Crook, T. R., &amp; Shook, C. L. (2005). The dimensionality of organizational performance and its implications for strategic management research. In D. J. Ketchen &amp; D. D. Bergh (Eds.),</w:t>
       </w:r>
       <w:r>
         <w:t xml:space="preserve"> </w:t>
@@ -21506,10 +22120,13 @@
           <w:iCs/>
           <w:i/>
         </w:rPr>
-        <w:t xml:space="preserve">Journal of International Business Studies, 34</w:t>
-      </w:r>
-      <w:r>
-        <w:t xml:space="preserve">(1), 5–18.</w:t>
+        <w:t xml:space="preserve">Research methodology in strategy and management</w:t>
+      </w:r>
+      <w:r>
+        <w:t xml:space="preserve"> </w:t>
+      </w:r>
+      <w:r>
+        <w:t xml:space="preserve">(Vol. 2, pp. 259–286). Emerald. https://doi.org/10.1016/S1479-8387(05)02011-4</w:t>
       </w:r>
     </w:p>
     <w:p>
@@ -21517,7 +22134,7 @@
         <w:pStyle w:val="BodyText"/>
       </w:pPr>
       <w:r>
-        <w:t xml:space="preserve">Cusolito, A. P., &amp; Maloney, W. F. (2018).</w:t>
+        <w:t xml:space="preserve">Contractor, F. J., Kundu, S. K., &amp; Hsu, C. C. (2003). A three-stage theory of international expansion.</w:t>
       </w:r>
       <w:r>
         <w:t xml:space="preserve"> </w:t>
@@ -21527,10 +22144,10 @@
           <w:iCs/>
           <w:i/>
         </w:rPr>
-        <w:t xml:space="preserve">Productivity revisited: Shifting paradigms in analysis and policy</w:t>
-      </w:r>
-      <w:r>
-        <w:t xml:space="preserve">. World Bank Group.</w:t>
+        <w:t xml:space="preserve">Journal of International Business Studies, 34</w:t>
+      </w:r>
+      <w:r>
+        <w:t xml:space="preserve">(1), 5–18.</w:t>
       </w:r>
     </w:p>
     <w:p>
@@ -21538,7 +22155,7 @@
         <w:pStyle w:val="BodyText"/>
       </w:pPr>
       <w:r>
-        <w:t xml:space="preserve">David, P. A. (1990). The dynamo and the computer: An historical perspective on the modern productivity paradox.</w:t>
+        <w:t xml:space="preserve">Cusolito, A. P., &amp; Maloney, W. F. (2018).</w:t>
       </w:r>
       <w:r>
         <w:t xml:space="preserve"> </w:t>
@@ -21548,10 +22165,10 @@
           <w:iCs/>
           <w:i/>
         </w:rPr>
-        <w:t xml:space="preserve">American Economic Review, 80</w:t>
-      </w:r>
-      <w:r>
-        <w:t xml:space="preserve">(2), 355–361.</w:t>
+        <w:t xml:space="preserve">Productivity revisited: Shifting paradigms in analysis and policy</w:t>
+      </w:r>
+      <w:r>
+        <w:t xml:space="preserve">. World Bank Group.</w:t>
       </w:r>
     </w:p>
     <w:p>
@@ -21559,7 +22176,7 @@
         <w:pStyle w:val="BodyText"/>
       </w:pPr>
       <w:r>
-        <w:t xml:space="preserve">Đỗ, T. H., &amp; Phan, A. T. (2026). Internationalization and firm performance in Vietnam.</w:t>
+        <w:t xml:space="preserve">David, P. A. (1990). The dynamo and the computer: An historical perspective on the modern productivity paradox.</w:t>
       </w:r>
       <w:r>
         <w:t xml:space="preserve"> </w:t>
@@ -21569,13 +22186,10 @@
           <w:iCs/>
           <w:i/>
         </w:rPr>
-        <w:t xml:space="preserve">Journal of Asia Business Studies</w:t>
-      </w:r>
-      <w:r>
-        <w:t xml:space="preserve"> </w:t>
-      </w:r>
-      <w:r>
-        <w:t xml:space="preserve">(đang phản biện).</w:t>
+        <w:t xml:space="preserve">American Economic Review, 80</w:t>
+      </w:r>
+      <w:r>
+        <w:t xml:space="preserve">(2), 355–361.</w:t>
       </w:r>
     </w:p>
     <w:p>
@@ -21583,7 +22197,7 @@
         <w:pStyle w:val="BodyText"/>
       </w:pPr>
       <w:r>
-        <w:t xml:space="preserve">Hall, P. A., &amp; Soskice, D. (Eds.). (2001).</w:t>
+        <w:t xml:space="preserve">Đỗ, T. H., &amp; Phan, A. T. (2026). Internationalization and firm performance in Vietnam.</w:t>
       </w:r>
       <w:r>
         <w:t xml:space="preserve"> </w:t>
@@ -21593,10 +22207,13 @@
           <w:iCs/>
           <w:i/>
         </w:rPr>
-        <w:t xml:space="preserve">Varieties of capitalism: The institutional foundations of comparative advantage</w:t>
-      </w:r>
-      <w:r>
-        <w:t xml:space="preserve">. Oxford University Press.</w:t>
+        <w:t xml:space="preserve">Journal of Economics and Development</w:t>
+      </w:r>
+      <w:r>
+        <w:t xml:space="preserve"> </w:t>
+      </w:r>
+      <w:r>
+        <w:t xml:space="preserve">(chưa nộp).</w:t>
       </w:r>
     </w:p>
     <w:p>
@@ -21604,7 +22221,7 @@
         <w:pStyle w:val="BodyText"/>
       </w:pPr>
       <w:r>
-        <w:t xml:space="preserve">Hambrick, D. C., &amp; Mason, P. A. (1984). Upper echelons: The organization as a reflection of its top managers.</w:t>
+        <w:t xml:space="preserve">Hall, P. A., &amp; Soskice, D. (Eds.). (2001).</w:t>
       </w:r>
       <w:r>
         <w:t xml:space="preserve"> </w:t>
@@ -21614,10 +22231,10 @@
           <w:iCs/>
           <w:i/>
         </w:rPr>
-        <w:t xml:space="preserve">Academy of Management Review, 9</w:t>
-      </w:r>
-      <w:r>
-        <w:t xml:space="preserve">(2), 193–206. https://doi.org/10.5465/amr.1984.4277628</w:t>
+        <w:t xml:space="preserve">Varieties of capitalism: The institutional foundations of comparative advantage</w:t>
+      </w:r>
+      <w:r>
+        <w:t xml:space="preserve">. Oxford University Press.</w:t>
       </w:r>
     </w:p>
     <w:p>
@@ -21625,7 +22242,7 @@
         <w:pStyle w:val="BodyText"/>
       </w:pPr>
       <w:r>
-        <w:t xml:space="preserve">Hertog, S. (2010).</w:t>
+        <w:t xml:space="preserve">Hambrick, D. C., &amp; Mason, P. A. (1984). Upper echelons: The organization as a reflection of its top managers.</w:t>
       </w:r>
       <w:r>
         <w:t xml:space="preserve"> </w:t>
@@ -21635,10 +22252,10 @@
           <w:iCs/>
           <w:i/>
         </w:rPr>
-        <w:t xml:space="preserve">Princes, brokers, and bureaucrats: Oil and the state in Saudi Arabia</w:t>
-      </w:r>
-      <w:r>
-        <w:t xml:space="preserve">. Cornell University Press.</w:t>
+        <w:t xml:space="preserve">Academy of Management Review, 9</w:t>
+      </w:r>
+      <w:r>
+        <w:t xml:space="preserve">(2), 193–206. https://doi.org/10.5465/amr.1984.4277628</w:t>
       </w:r>
     </w:p>
     <w:p>
@@ -21646,7 +22263,7 @@
         <w:pStyle w:val="BodyText"/>
       </w:pPr>
       <w:r>
-        <w:t xml:space="preserve">Hessels, J., &amp; Terjesen, S. (2010). Resource dependency and institutional theory perspectives on direct and indirect export choices.</w:t>
+        <w:t xml:space="preserve">Hertog, S. (2010).</w:t>
       </w:r>
       <w:r>
         <w:t xml:space="preserve"> </w:t>
@@ -21656,10 +22273,10 @@
           <w:iCs/>
           <w:i/>
         </w:rPr>
-        <w:t xml:space="preserve">Small Business Economics, 34</w:t>
-      </w:r>
-      <w:r>
-        <w:t xml:space="preserve">(2), 203–220. https://doi.org/10.1007/s11187-008-9156-4</w:t>
+        <w:t xml:space="preserve">Princes, brokers, and bureaucrats: Oil and the state in Saudi Arabia</w:t>
+      </w:r>
+      <w:r>
+        <w:t xml:space="preserve">. Cornell University Press.</w:t>
       </w:r>
     </w:p>
     <w:p>
@@ -21667,7 +22284,7 @@
         <w:pStyle w:val="BodyText"/>
       </w:pPr>
       <w:r>
-        <w:t xml:space="preserve">Hsieh, C.-T., &amp; Klenow, P. J. (2009). Misallocation and manufacturing TFP in China and India.</w:t>
+        <w:t xml:space="preserve">Hessels, J., &amp; Terjesen, S. (2010). Resource dependency and institutional theory perspectives on direct and indirect export choices.</w:t>
       </w:r>
       <w:r>
         <w:t xml:space="preserve"> </w:t>
@@ -21677,10 +22294,10 @@
           <w:iCs/>
           <w:i/>
         </w:rPr>
-        <w:t xml:space="preserve">Quarterly Journal of Economics, 124</w:t>
-      </w:r>
-      <w:r>
-        <w:t xml:space="preserve">(4), 1403–1448.</w:t>
+        <w:t xml:space="preserve">Small Business Economics, 34</w:t>
+      </w:r>
+      <w:r>
+        <w:t xml:space="preserve">(2), 203–220. https://doi.org/10.1007/s11187-008-9156-4</w:t>
       </w:r>
     </w:p>
     <w:p>
@@ -21688,7 +22305,7 @@
         <w:pStyle w:val="BodyText"/>
       </w:pPr>
       <w:r>
-        <w:t xml:space="preserve">Hsieh, C.-T., &amp; Klenow, P. J. (2014). The life cycle of plants in India and Mexico.</w:t>
+        <w:t xml:space="preserve">Hsieh, C.-T., &amp; Klenow, P. J. (2009). Misallocation and manufacturing TFP in China and India.</w:t>
       </w:r>
       <w:r>
         <w:t xml:space="preserve"> </w:t>
@@ -21698,10 +22315,10 @@
           <w:iCs/>
           <w:i/>
         </w:rPr>
-        <w:t xml:space="preserve">Quarterly Journal of Economics, 129</w:t>
-      </w:r>
-      <w:r>
-        <w:t xml:space="preserve">(3), 1035–1084.</w:t>
+        <w:t xml:space="preserve">Quarterly Journal of Economics, 124</w:t>
+      </w:r>
+      <w:r>
+        <w:t xml:space="preserve">(4), 1403–1448.</w:t>
       </w:r>
     </w:p>
     <w:p>
@@ -21709,7 +22326,7 @@
         <w:pStyle w:val="BodyText"/>
       </w:pPr>
       <w:r>
-        <w:t xml:space="preserve">Johanson, J., &amp; Vahlne, J.-E. (1977). The internationalization process of the firm.</w:t>
+        <w:t xml:space="preserve">Hsieh, C.-T., &amp; Klenow, P. J. (2014). The life cycle of plants in India and Mexico.</w:t>
       </w:r>
       <w:r>
         <w:t xml:space="preserve"> </w:t>
@@ -21719,10 +22336,10 @@
           <w:iCs/>
           <w:i/>
         </w:rPr>
-        <w:t xml:space="preserve">Journal of International Business Studies, 8</w:t>
-      </w:r>
-      <w:r>
-        <w:t xml:space="preserve">(1), 23–32.</w:t>
+        <w:t xml:space="preserve">Quarterly Journal of Economics, 129</w:t>
+      </w:r>
+      <w:r>
+        <w:t xml:space="preserve">(3), 1035–1084.</w:t>
       </w:r>
     </w:p>
     <w:p>
@@ -21730,7 +22347,7 @@
         <w:pStyle w:val="BodyText"/>
       </w:pPr>
       <w:r>
-        <w:t xml:space="preserve">Johanson, J., &amp; Vahlne, J.-E. (2009). The Uppsala internationalization process model revisited.</w:t>
+        <w:t xml:space="preserve">Johanson, J., &amp; Vahlne, J.-E. (1977). The internationalization process of the firm.</w:t>
       </w:r>
       <w:r>
         <w:t xml:space="preserve"> </w:t>
@@ -21740,10 +22357,10 @@
           <w:iCs/>
           <w:i/>
         </w:rPr>
-        <w:t xml:space="preserve">Journal of International Business Studies, 40</w:t>
-      </w:r>
-      <w:r>
-        <w:t xml:space="preserve">(9), 1411–1431.</w:t>
+        <w:t xml:space="preserve">Journal of International Business Studies, 8</w:t>
+      </w:r>
+      <w:r>
+        <w:t xml:space="preserve">(1), 23–32.</w:t>
       </w:r>
     </w:p>
     <w:p>
@@ -21751,7 +22368,7 @@
         <w:pStyle w:val="BodyText"/>
       </w:pPr>
       <w:r>
-        <w:t xml:space="preserve">Kafouros, M., Wang, C., Piperopoulos, P., &amp; Zhang, M. (2023). Academic publishing in business and management.</w:t>
+        <w:t xml:space="preserve">Johanson, J., &amp; Vahlne, J.-E. (2009). The Uppsala internationalization process model revisited.</w:t>
       </w:r>
       <w:r>
         <w:t xml:space="preserve"> </w:t>
@@ -21761,10 +22378,10 @@
           <w:iCs/>
           <w:i/>
         </w:rPr>
-        <w:t xml:space="preserve">Global Strategy Journal, 13</w:t>
-      </w:r>
-      <w:r>
-        <w:t xml:space="preserve">(1), 3–28.</w:t>
+        <w:t xml:space="preserve">Journal of International Business Studies, 40</w:t>
+      </w:r>
+      <w:r>
+        <w:t xml:space="preserve">(9), 1411–1431.</w:t>
       </w:r>
     </w:p>
     <w:p>
@@ -21772,7 +22389,7 @@
         <w:pStyle w:val="BodyText"/>
       </w:pPr>
       <w:r>
-        <w:t xml:space="preserve">Kaufmann, D., Kraay, A., &amp; Mastruzzi, M. (2011). The worldwide governance indicators: Methodology and analytical issues.</w:t>
+        <w:t xml:space="preserve">Kafouros, M., Wang, C., Piperopoulos, P., &amp; Zhang, M. (2023). Academic publishing in business and management.</w:t>
       </w:r>
       <w:r>
         <w:t xml:space="preserve"> </w:t>
@@ -21782,10 +22399,10 @@
           <w:iCs/>
           <w:i/>
         </w:rPr>
-        <w:t xml:space="preserve">Hague Journal on the Rule of Law, 3</w:t>
-      </w:r>
-      <w:r>
-        <w:t xml:space="preserve">(2), 220–246.</w:t>
+        <w:t xml:space="preserve">Global Strategy Journal, 13</w:t>
+      </w:r>
+      <w:r>
+        <w:t xml:space="preserve">(1), 3–28.</w:t>
       </w:r>
     </w:p>
     <w:p>
@@ -21793,7 +22410,7 @@
         <w:pStyle w:val="BodyText"/>
       </w:pPr>
       <w:r>
-        <w:t xml:space="preserve">Khanna, T., &amp; Palepu, K. G. (2010).</w:t>
+        <w:t xml:space="preserve">Kaufmann, D., Kraay, A., &amp; Mastruzzi, M. (2011). The worldwide governance indicators: Methodology and analytical issues.</w:t>
       </w:r>
       <w:r>
         <w:t xml:space="preserve"> </w:t>
@@ -21803,10 +22420,10 @@
           <w:iCs/>
           <w:i/>
         </w:rPr>
-        <w:t xml:space="preserve">Winning in emerging markets: A road map for strategy and execution</w:t>
-      </w:r>
-      <w:r>
-        <w:t xml:space="preserve">. Harvard Business Press.</w:t>
+        <w:t xml:space="preserve">Hague Journal on the Rule of Law, 3</w:t>
+      </w:r>
+      <w:r>
+        <w:t xml:space="preserve">(2), 220–246.</w:t>
       </w:r>
     </w:p>
     <w:p>
@@ -21814,7 +22431,7 @@
         <w:pStyle w:val="BodyText"/>
       </w:pPr>
       <w:r>
-        <w:t xml:space="preserve">Kirca, A. H., Roth, K., Hult, G. T. M., &amp; Cavusgil, S. T. (2012). The role of context in the multinationality-performance relationship: A meta-analytic review.</w:t>
+        <w:t xml:space="preserve">Khanna, T., &amp; Palepu, K. G. (2010).</w:t>
       </w:r>
       <w:r>
         <w:t xml:space="preserve"> </w:t>
@@ -21824,10 +22441,10 @@
           <w:iCs/>
           <w:i/>
         </w:rPr>
-        <w:t xml:space="preserve">Global Strategy Journal, 2</w:t>
-      </w:r>
-      <w:r>
-        <w:t xml:space="preserve">(2), 108–121.</w:t>
+        <w:t xml:space="preserve">Winning in emerging markets: A road map for strategy and execution</w:t>
+      </w:r>
+      <w:r>
+        <w:t xml:space="preserve">. Harvard Business Press.</w:t>
       </w:r>
     </w:p>
     <w:p>
@@ -21835,7 +22452,7 @@
         <w:pStyle w:val="BodyText"/>
       </w:pPr>
       <w:r>
-        <w:t xml:space="preserve">La Porta, R., &amp; Shleifer, A. (2008). The unofficial economy and economic development.</w:t>
+        <w:t xml:space="preserve">Kirca, A. H., Roth, K., Hult, G. T. M., &amp; Cavusgil, S. T. (2012). The role of context in the multinationality-performance relationship: A meta-analytic review.</w:t>
       </w:r>
       <w:r>
         <w:t xml:space="preserve"> </w:t>
@@ -21845,10 +22462,10 @@
           <w:iCs/>
           <w:i/>
         </w:rPr>
-        <w:t xml:space="preserve">Brookings Papers on Economic Activity, 2008</w:t>
-      </w:r>
-      <w:r>
-        <w:t xml:space="preserve">(2), 275–352.</w:t>
+        <w:t xml:space="preserve">Global Strategy Journal, 2</w:t>
+      </w:r>
+      <w:r>
+        <w:t xml:space="preserve">(2), 108–121.</w:t>
       </w:r>
     </w:p>
     <w:p>
@@ -21856,7 +22473,7 @@
         <w:pStyle w:val="BodyText"/>
       </w:pPr>
       <w:r>
-        <w:t xml:space="preserve">La Porta, R., &amp; Shleifer, A. (2014). Informality and development.</w:t>
+        <w:t xml:space="preserve">La Porta, R., &amp; Shleifer, A. (2008). The unofficial economy and economic development.</w:t>
       </w:r>
       <w:r>
         <w:t xml:space="preserve"> </w:t>
@@ -21866,10 +22483,10 @@
           <w:iCs/>
           <w:i/>
         </w:rPr>
-        <w:t xml:space="preserve">Journal of Economic Perspectives, 28</w:t>
-      </w:r>
-      <w:r>
-        <w:t xml:space="preserve">(3), 109–126. https://doi.org/10.1257/jep.28.3.109</w:t>
+        <w:t xml:space="preserve">Brookings Papers on Economic Activity, 2008</w:t>
+      </w:r>
+      <w:r>
+        <w:t xml:space="preserve">(2), 275–352.</w:t>
       </w:r>
     </w:p>
     <w:p>
@@ -21877,7 +22494,7 @@
         <w:pStyle w:val="BodyText"/>
       </w:pPr>
       <w:r>
-        <w:t xml:space="preserve">Lall, S. (1992). Technological capabilities and industrialization.</w:t>
+        <w:t xml:space="preserve">La Porta, R., &amp; Shleifer, A. (2014). Informality and development.</w:t>
       </w:r>
       <w:r>
         <w:t xml:space="preserve"> </w:t>
@@ -21887,10 +22504,10 @@
           <w:iCs/>
           <w:i/>
         </w:rPr>
-        <w:t xml:space="preserve">World Development, 20</w:t>
-      </w:r>
-      <w:r>
-        <w:t xml:space="preserve">(2), 165–186. https://doi.org/10.1016/0305-750X(92)90097-F</w:t>
+        <w:t xml:space="preserve">Journal of Economic Perspectives, 28</w:t>
+      </w:r>
+      <w:r>
+        <w:t xml:space="preserve">(3), 109–126. https://doi.org/10.1257/jep.28.3.109</w:t>
       </w:r>
     </w:p>
     <w:p>
@@ -21898,7 +22515,7 @@
         <w:pStyle w:val="BodyText"/>
       </w:pPr>
       <w:r>
-        <w:t xml:space="preserve">Lu, J. W., &amp; Beamish, P. W. (2001). The internationalization and performance of SMEs.</w:t>
+        <w:t xml:space="preserve">Lall, S. (1992). Technological capabilities and industrialization.</w:t>
       </w:r>
       <w:r>
         <w:t xml:space="preserve"> </w:t>
@@ -21908,10 +22525,10 @@
           <w:iCs/>
           <w:i/>
         </w:rPr>
-        <w:t xml:space="preserve">Strategic Management Journal, 22</w:t>
-      </w:r>
-      <w:r>
-        <w:t xml:space="preserve">(6–7), 565–586. https://doi.org/10.1002/smj.184</w:t>
+        <w:t xml:space="preserve">World Development, 20</w:t>
+      </w:r>
+      <w:r>
+        <w:t xml:space="preserve">(2), 165–186. https://doi.org/10.1016/0305-750X(92)90097-F</w:t>
       </w:r>
     </w:p>
     <w:p>
@@ -21919,7 +22536,7 @@
         <w:pStyle w:val="BodyText"/>
       </w:pPr>
       <w:r>
-        <w:t xml:space="preserve">Lu, J. W., &amp; Beamish, P. W. (2004). International diversification and firm performance: The S-curve hypothesis.</w:t>
+        <w:t xml:space="preserve">Lind, J. T., &amp; Mehlum, H. (2010). With or without U? The appropriate test for a U-shaped relationship.</w:t>
       </w:r>
       <w:r>
         <w:t xml:space="preserve"> </w:t>
@@ -21929,10 +22546,10 @@
           <w:iCs/>
           <w:i/>
         </w:rPr>
-        <w:t xml:space="preserve">Academy of Management Journal, 47</w:t>
-      </w:r>
-      <w:r>
-        <w:t xml:space="preserve">(4), 598–609.</w:t>
+        <w:t xml:space="preserve">Oxford Bulletin of Economics and Statistics, 72</w:t>
+      </w:r>
+      <w:r>
+        <w:t xml:space="preserve">(1), 109–118.</w:t>
       </w:r>
     </w:p>
     <w:p>
@@ -21940,7 +22557,7 @@
         <w:pStyle w:val="BodyText"/>
       </w:pPr>
       <w:r>
-        <w:t xml:space="preserve">Mar, T. T., Đỗ, T. H., &amp; Phan, A. T. (2026). Digital adoption and internationalization in Singapore.</w:t>
+        <w:t xml:space="preserve">Lu, J. W., &amp; Beamish, P. W. (2001). The internationalization and performance of SMEs.</w:t>
       </w:r>
       <w:r>
         <w:t xml:space="preserve"> </w:t>
@@ -21950,13 +22567,10 @@
           <w:iCs/>
           <w:i/>
         </w:rPr>
-        <w:t xml:space="preserve">Management International Review</w:t>
-      </w:r>
-      <w:r>
-        <w:t xml:space="preserve"> </w:t>
-      </w:r>
-      <w:r>
-        <w:t xml:space="preserve">(đang phản biện).</w:t>
+        <w:t xml:space="preserve">Strategic Management Journal, 22</w:t>
+      </w:r>
+      <w:r>
+        <w:t xml:space="preserve">(6–7), 565–586. https://doi.org/10.1002/smj.184</w:t>
       </w:r>
     </w:p>
     <w:p>
@@ -21964,7 +22578,7 @@
         <w:pStyle w:val="BodyText"/>
       </w:pPr>
       <w:r>
-        <w:t xml:space="preserve">Marano, V., Arregle, J.-L., Hitt, M. A., Spadafora, E., &amp; van Essen, M. (2016). Home country institutions and the internationalization-performance relationship.</w:t>
+        <w:t xml:space="preserve">Lu, J. W., &amp; Beamish, P. W. (2004). International diversification and firm performance: The S-curve hypothesis.</w:t>
       </w:r>
       <w:r>
         <w:t xml:space="preserve"> </w:t>
@@ -21974,10 +22588,10 @@
           <w:iCs/>
           <w:i/>
         </w:rPr>
-        <w:t xml:space="preserve">Journal of Management, 42</w:t>
-      </w:r>
-      <w:r>
-        <w:t xml:space="preserve">(5), 1075–1110.</w:t>
+        <w:t xml:space="preserve">Academy of Management Journal, 47</w:t>
+      </w:r>
+      <w:r>
+        <w:t xml:space="preserve">(4), 598–609.</w:t>
       </w:r>
     </w:p>
     <w:p>
@@ -21985,7 +22599,7 @@
         <w:pStyle w:val="BodyText"/>
       </w:pPr>
       <w:r>
-        <w:t xml:space="preserve">North, D. C. (1990).</w:t>
+        <w:t xml:space="preserve">Mar, T. T., Đỗ, T. H., &amp; Phan, A. T. (2026). Digital adoption and internationalization in Singapore.</w:t>
       </w:r>
       <w:r>
         <w:t xml:space="preserve"> </w:t>
@@ -21995,10 +22609,13 @@
           <w:iCs/>
           <w:i/>
         </w:rPr>
-        <w:t xml:space="preserve">Institutions, institutional change and economic performance</w:t>
-      </w:r>
-      <w:r>
-        <w:t xml:space="preserve">. Cambridge University Press.</w:t>
+        <w:t xml:space="preserve">Management International Review</w:t>
+      </w:r>
+      <w:r>
+        <w:t xml:space="preserve"> </w:t>
+      </w:r>
+      <w:r>
+        <w:t xml:space="preserve">(chưa nộp).</w:t>
       </w:r>
     </w:p>
     <w:p>
@@ -22006,7 +22623,7 @@
         <w:pStyle w:val="BodyText"/>
       </w:pPr>
       <w:r>
-        <w:t xml:space="preserve">Paternoster, R., Brame, R., Mazerolle, P., &amp; Piquero, A. (1998). Using the correct statistical test for the equality of regression coefficients.</w:t>
+        <w:t xml:space="preserve">Marano, V., Arregle, J.-L., Hitt, M. A., Spadafora, E., &amp; van Essen, M. (2016). Home country institutions and the internationalization-performance relationship.</w:t>
       </w:r>
       <w:r>
         <w:t xml:space="preserve"> </w:t>
@@ -22016,10 +22633,10 @@
           <w:iCs/>
           <w:i/>
         </w:rPr>
-        <w:t xml:space="preserve">Criminology, 36</w:t>
-      </w:r>
-      <w:r>
-        <w:t xml:space="preserve">(4), 859–866.</w:t>
+        <w:t xml:space="preserve">Journal of Management, 42</w:t>
+      </w:r>
+      <w:r>
+        <w:t xml:space="preserve">(5), 1075–1110.</w:t>
       </w:r>
     </w:p>
     <w:p>
@@ -22027,7 +22644,7 @@
         <w:pStyle w:val="BodyText"/>
       </w:pPr>
       <w:r>
-        <w:t xml:space="preserve">Peng, M. W. (2001). The resource-based view and international business.</w:t>
+        <w:t xml:space="preserve">North, D. C. (1990).</w:t>
       </w:r>
       <w:r>
         <w:t xml:space="preserve"> </w:t>
@@ -22037,10 +22654,10 @@
           <w:iCs/>
           <w:i/>
         </w:rPr>
-        <w:t xml:space="preserve">Journal of Management, 27</w:t>
-      </w:r>
-      <w:r>
-        <w:t xml:space="preserve">(6), 803–829.</w:t>
+        <w:t xml:space="preserve">Institutions, institutional change and economic performance</w:t>
+      </w:r>
+      <w:r>
+        <w:t xml:space="preserve">. Cambridge University Press.</w:t>
       </w:r>
     </w:p>
     <w:p>
@@ -22048,7 +22665,7 @@
         <w:pStyle w:val="BodyText"/>
       </w:pPr>
       <w:r>
-        <w:t xml:space="preserve">Peng, M. W. (2003). Institutional transitions and strategic choices.</w:t>
+        <w:t xml:space="preserve">Paternoster, R., Brame, R., Mazerolle, P., &amp; Piquero, A. (1998). Using the correct statistical test for the equality of regression coefficients.</w:t>
       </w:r>
       <w:r>
         <w:t xml:space="preserve"> </w:t>
@@ -22058,10 +22675,10 @@
           <w:iCs/>
           <w:i/>
         </w:rPr>
-        <w:t xml:space="preserve">Academy of Management Review, 28</w:t>
-      </w:r>
-      <w:r>
-        <w:t xml:space="preserve">(2), 275–296.</w:t>
+        <w:t xml:space="preserve">Criminology, 36</w:t>
+      </w:r>
+      <w:r>
+        <w:t xml:space="preserve">(4), 859–866.</w:t>
       </w:r>
     </w:p>
     <w:p>
@@ -22069,7 +22686,7 @@
         <w:pStyle w:val="BodyText"/>
       </w:pPr>
       <w:r>
-        <w:t xml:space="preserve">Peng, M. W., &amp; Ilinitch, A. Y. (1998). Export intermediary firms: A note on export development research.</w:t>
+        <w:t xml:space="preserve">Peng, M. W. (2001). The resource-based view and international business.</w:t>
       </w:r>
       <w:r>
         <w:t xml:space="preserve"> </w:t>
@@ -22079,10 +22696,10 @@
           <w:iCs/>
           <w:i/>
         </w:rPr>
-        <w:t xml:space="preserve">Journal of International Business Studies, 29</w:t>
-      </w:r>
-      <w:r>
-        <w:t xml:space="preserve">(3), 609–620. https://doi.org/10.1057/palgrave.jibs.8490011</w:t>
+        <w:t xml:space="preserve">Journal of Management, 27</w:t>
+      </w:r>
+      <w:r>
+        <w:t xml:space="preserve">(6), 803–829.</w:t>
       </w:r>
     </w:p>
     <w:p>
@@ -22090,7 +22707,7 @@
         <w:pStyle w:val="BodyText"/>
       </w:pPr>
       <w:r>
-        <w:t xml:space="preserve">Richard, P. J., Devinney, T. M., Yip, G. S., &amp; Johnson, G. (2009). Measuring organizational performance: Towards methodological best practice.</w:t>
+        <w:t xml:space="preserve">Peng, M. W. (2003). Institutional transitions and strategic choices.</w:t>
       </w:r>
       <w:r>
         <w:t xml:space="preserve"> </w:t>
@@ -22100,10 +22717,10 @@
           <w:iCs/>
           <w:i/>
         </w:rPr>
-        <w:t xml:space="preserve">Journal of Management, 35</w:t>
-      </w:r>
-      <w:r>
-        <w:t xml:space="preserve">(3), 718–804. https://doi.org/10.1177/0149206308330560</w:t>
+        <w:t xml:space="preserve">Academy of Management Review, 28</w:t>
+      </w:r>
+      <w:r>
+        <w:t xml:space="preserve">(2), 275–296.</w:t>
       </w:r>
     </w:p>
     <w:p>
@@ -22111,7 +22728,7 @@
         <w:pStyle w:val="BodyText"/>
       </w:pPr>
       <w:r>
-        <w:t xml:space="preserve">Sachs, J. D., &amp; Warner, A. M. (2001). The curse of natural resources.</w:t>
+        <w:t xml:space="preserve">Peng, M. W., &amp; Ilinitch, A. Y. (1998). Export intermediary firms: A note on export development research.</w:t>
       </w:r>
       <w:r>
         <w:t xml:space="preserve"> </w:t>
@@ -22121,10 +22738,10 @@
           <w:iCs/>
           <w:i/>
         </w:rPr>
-        <w:t xml:space="preserve">European Economic Review, 45</w:t>
-      </w:r>
-      <w:r>
-        <w:t xml:space="preserve">(4–6), 827–838.</w:t>
+        <w:t xml:space="preserve">Journal of International Business Studies, 29</w:t>
+      </w:r>
+      <w:r>
+        <w:t xml:space="preserve">(3), 609–620. https://doi.org/10.1057/palgrave.jibs.8490011</w:t>
       </w:r>
     </w:p>
     <w:p>
@@ -22132,7 +22749,7 @@
         <w:pStyle w:val="BodyText"/>
       </w:pPr>
       <w:r>
-        <w:t xml:space="preserve">Schwens, C., Zapkau, F. B., Brouthers, K. D., &amp; Hollender, L. (2018). How overconfidence can blind internationalization performance predictions.</w:t>
+        <w:t xml:space="preserve">Richard, P. J., Devinney, T. M., Yip, G. S., &amp; Johnson, G. (2009). Measuring organizational performance: Towards methodological best practice.</w:t>
       </w:r>
       <w:r>
         <w:t xml:space="preserve"> </w:t>
@@ -22142,10 +22759,10 @@
           <w:iCs/>
           <w:i/>
         </w:rPr>
-        <w:t xml:space="preserve">Journal of World Business, 53</w:t>
-      </w:r>
-      <w:r>
-        <w:t xml:space="preserve">(3), 290–301.</w:t>
+        <w:t xml:space="preserve">Journal of Management, 35</w:t>
+      </w:r>
+      <w:r>
+        <w:t xml:space="preserve">(3), 718–804. https://doi.org/10.1177/0149206308330560</w:t>
       </w:r>
     </w:p>
     <w:p>
@@ -22153,7 +22770,7 @@
         <w:pStyle w:val="BodyText"/>
       </w:pPr>
       <w:r>
-        <w:t xml:space="preserve">Scott, W. R. (1995).</w:t>
+        <w:t xml:space="preserve">Sachs, J. D., &amp; Warner, A. M. (2001). The curse of natural resources.</w:t>
       </w:r>
       <w:r>
         <w:t xml:space="preserve"> </w:t>
@@ -22163,10 +22780,10 @@
           <w:iCs/>
           <w:i/>
         </w:rPr>
-        <w:t xml:space="preserve">Institutions and organizations</w:t>
-      </w:r>
-      <w:r>
-        <w:t xml:space="preserve">. Sage.</w:t>
+        <w:t xml:space="preserve">European Economic Review, 45</w:t>
+      </w:r>
+      <w:r>
+        <w:t xml:space="preserve">(4–6), 827–838.</w:t>
       </w:r>
     </w:p>
     <w:p>
@@ -22174,7 +22791,7 @@
         <w:pStyle w:val="BodyText"/>
       </w:pPr>
       <w:r>
-        <w:t xml:space="preserve">Sikdar, A., &amp; Mukhopadhyay, A. (2026). Technology spillovers and firm performance in India.</w:t>
+        <w:t xml:space="preserve">Schwens, C., Zapkau, F. B., Brouthers, K. D., &amp; Hollender, L. (2018). How overconfidence can blind internationalization performance predictions.</w:t>
       </w:r>
       <w:r>
         <w:t xml:space="preserve"> </w:t>
@@ -22184,10 +22801,10 @@
           <w:iCs/>
           <w:i/>
         </w:rPr>
-        <w:t xml:space="preserve">Asian Development Review, 43</w:t>
-      </w:r>
-      <w:r>
-        <w:t xml:space="preserve">(1), 37–75.</w:t>
+        <w:t xml:space="preserve">Journal of World Business, 53</w:t>
+      </w:r>
+      <w:r>
+        <w:t xml:space="preserve">(3), 290–301.</w:t>
       </w:r>
     </w:p>
     <w:p>
@@ -22195,7 +22812,7 @@
         <w:pStyle w:val="BodyText"/>
       </w:pPr>
       <w:r>
-        <w:t xml:space="preserve">Stallkamp, M., &amp; Schotter, A. P. J. (2021). Platforms without borders?</w:t>
+        <w:t xml:space="preserve">Scott, W. R. (1995).</w:t>
       </w:r>
       <w:r>
         <w:t xml:space="preserve"> </w:t>
@@ -22205,10 +22822,10 @@
           <w:iCs/>
           <w:i/>
         </w:rPr>
-        <w:t xml:space="preserve">Global Strategy Journal, 11</w:t>
-      </w:r>
-      <w:r>
-        <w:t xml:space="preserve">(1), 58–80.</w:t>
+        <w:t xml:space="preserve">Institutions and organizations</w:t>
+      </w:r>
+      <w:r>
+        <w:t xml:space="preserve">. Sage.</w:t>
       </w:r>
     </w:p>
     <w:p>
@@ -22216,7 +22833,7 @@
         <w:pStyle w:val="BodyText"/>
       </w:pPr>
       <w:r>
-        <w:t xml:space="preserve">StartupBlink. (2026).</w:t>
+        <w:t xml:space="preserve">Sikdar, A., &amp; Mukhopadhyay, A. (2026). Technology spillovers and firm performance in India.</w:t>
       </w:r>
       <w:r>
         <w:t xml:space="preserve"> </w:t>
@@ -22226,10 +22843,10 @@
           <w:iCs/>
           <w:i/>
         </w:rPr>
-        <w:t xml:space="preserve">Global startup ecosystem index 2026</w:t>
-      </w:r>
-      <w:r>
-        <w:t xml:space="preserve">. StartupBlink Research.</w:t>
+        <w:t xml:space="preserve">Asian Development Review, 43</w:t>
+      </w:r>
+      <w:r>
+        <w:t xml:space="preserve">(1), 37–75.</w:t>
       </w:r>
     </w:p>
     <w:p>
@@ -22237,7 +22854,7 @@
         <w:pStyle w:val="BodyText"/>
       </w:pPr>
       <w:r>
-        <w:t xml:space="preserve">Sullivan, D. (1994). Measuring the degree of internationalization of a firm.</w:t>
+        <w:t xml:space="preserve">Stallkamp, M., &amp; Schotter, A. P. J. (2021). Platforms without borders?</w:t>
       </w:r>
       <w:r>
         <w:t xml:space="preserve"> </w:t>
@@ -22247,10 +22864,10 @@
           <w:iCs/>
           <w:i/>
         </w:rPr>
-        <w:t xml:space="preserve">Journal of International Business Studies, 25</w:t>
-      </w:r>
-      <w:r>
-        <w:t xml:space="preserve">(2), 325–342. https://doi.org/10.1057/palgrave.jibs.8490203</w:t>
+        <w:t xml:space="preserve">Global Strategy Journal, 11</w:t>
+      </w:r>
+      <w:r>
+        <w:t xml:space="preserve">(1), 58–80.</w:t>
       </w:r>
     </w:p>
     <w:p>
@@ -22258,7 +22875,7 @@
         <w:pStyle w:val="BodyText"/>
       </w:pPr>
       <w:r>
-        <w:t xml:space="preserve">Teece, D. J., Pisano, G., &amp; Shuen, A. (1997). Dynamic capabilities and strategic management.</w:t>
+        <w:t xml:space="preserve">StartupBlink. (2026).</w:t>
       </w:r>
       <w:r>
         <w:t xml:space="preserve"> </w:t>
@@ -22268,10 +22885,10 @@
           <w:iCs/>
           <w:i/>
         </w:rPr>
-        <w:t xml:space="preserve">Strategic Management Journal, 18</w:t>
-      </w:r>
-      <w:r>
-        <w:t xml:space="preserve">(7), 509–533.</w:t>
+        <w:t xml:space="preserve">Global startup ecosystem index 2026</w:t>
+      </w:r>
+      <w:r>
+        <w:t xml:space="preserve">. StartupBlink Research.</w:t>
       </w:r>
     </w:p>
     <w:p>
@@ -22279,7 +22896,7 @@
         <w:pStyle w:val="BodyText"/>
       </w:pPr>
       <w:r>
-        <w:t xml:space="preserve">UNCTAD. (2023).</w:t>
+        <w:t xml:space="preserve">Sullivan, D. (1994). Measuring the degree of internationalization of a firm.</w:t>
       </w:r>
       <w:r>
         <w:t xml:space="preserve"> </w:t>
@@ -22289,10 +22906,10 @@
           <w:iCs/>
           <w:i/>
         </w:rPr>
-        <w:t xml:space="preserve">World investment report 2023</w:t>
-      </w:r>
-      <w:r>
-        <w:t xml:space="preserve">. United Nations Conference on Trade and Development.</w:t>
+        <w:t xml:space="preserve">Journal of International Business Studies, 25</w:t>
+      </w:r>
+      <w:r>
+        <w:t xml:space="preserve">(2), 325–342. https://doi.org/10.1057/palgrave.jibs.8490203</w:t>
       </w:r>
     </w:p>
     <w:p>
@@ -22300,7 +22917,7 @@
         <w:pStyle w:val="BodyText"/>
       </w:pPr>
       <w:r>
-        <w:t xml:space="preserve">Venkatraman, N., &amp; Ramanujam, V. (1986). Measurement of business performance in strategy research.</w:t>
+        <w:t xml:space="preserve">Teece, D. J., Pisano, G., &amp; Shuen, A. (1997). Dynamic capabilities and strategic management.</w:t>
       </w:r>
       <w:r>
         <w:t xml:space="preserve"> </w:t>
@@ -22310,10 +22927,10 @@
           <w:iCs/>
           <w:i/>
         </w:rPr>
-        <w:t xml:space="preserve">Academy of Management Review, 11</w:t>
-      </w:r>
-      <w:r>
-        <w:t xml:space="preserve">(4), 801–814.</w:t>
+        <w:t xml:space="preserve">Strategic Management Journal, 18</w:t>
+      </w:r>
+      <w:r>
+        <w:t xml:space="preserve">(7), 509–533.</w:t>
       </w:r>
     </w:p>
     <w:p>
@@ -22321,7 +22938,7 @@
         <w:pStyle w:val="BodyText"/>
       </w:pPr>
       <w:r>
-        <w:t xml:space="preserve">Verhoef, P. C., Broekhuizen, T., Bart, Y., Bhattacharya, A., Dong, J. Q., Fabian, N., &amp; Haenlein, M. (2021). Digital transformation: A multidisciplinary reflection and research agenda.</w:t>
+        <w:t xml:space="preserve">UNCTAD. (2023).</w:t>
       </w:r>
       <w:r>
         <w:t xml:space="preserve"> </w:t>
@@ -22331,10 +22948,10 @@
           <w:iCs/>
           <w:i/>
         </w:rPr>
-        <w:t xml:space="preserve">Journal of Business Research, 122</w:t>
-      </w:r>
-      <w:r>
-        <w:t xml:space="preserve">, 889–901.</w:t>
+        <w:t xml:space="preserve">World investment report 2023</w:t>
+      </w:r>
+      <w:r>
+        <w:t xml:space="preserve">. United Nations Conference on Trade and Development.</w:t>
       </w:r>
     </w:p>
     <w:p>
@@ -22342,7 +22959,7 @@
         <w:pStyle w:val="BodyText"/>
       </w:pPr>
       <w:r>
-        <w:t xml:space="preserve">Wang, J., Huang, Y., &amp; Hong, H. (2024). Technology concentration and bank risk: Evidence from Chinese commercial banks.</w:t>
+        <w:t xml:space="preserve">Venkatraman, N., &amp; Ramanujam, V. (1986). Measurement of business performance in strategy research.</w:t>
       </w:r>
       <w:r>
         <w:t xml:space="preserve"> </w:t>
@@ -22352,10 +22969,10 @@
           <w:iCs/>
           <w:i/>
         </w:rPr>
-        <w:t xml:space="preserve">International Review of Financial Analysis, 91</w:t>
-      </w:r>
-      <w:r>
-        <w:t xml:space="preserve">, 102968.</w:t>
+        <w:t xml:space="preserve">Academy of Management Review, 11</w:t>
+      </w:r>
+      <w:r>
+        <w:t xml:space="preserve">(4), 801–814.</w:t>
       </w:r>
     </w:p>
     <w:p>
@@ -22363,7 +22980,7 @@
         <w:pStyle w:val="BodyText"/>
       </w:pPr>
       <w:r>
-        <w:t xml:space="preserve">Wernerfelt, B. (1984). A resource-based view of the firm.</w:t>
+        <w:t xml:space="preserve">Verhoef, P. C., Broekhuizen, T., Bart, Y., Bhattacharya, A., Dong, J. Q., Fabian, N., &amp; Haenlein, M. (2021). Digital transformation: A multidisciplinary reflection and research agenda.</w:t>
       </w:r>
       <w:r>
         <w:t xml:space="preserve"> </w:t>
@@ -22373,10 +22990,10 @@
           <w:iCs/>
           <w:i/>
         </w:rPr>
-        <w:t xml:space="preserve">Strategic Management Journal, 5</w:t>
-      </w:r>
-      <w:r>
-        <w:t xml:space="preserve">(2), 171–180.</w:t>
+        <w:t xml:space="preserve">Journal of Business Research, 122</w:t>
+      </w:r>
+      <w:r>
+        <w:t xml:space="preserve">, 889–901.</w:t>
       </w:r>
     </w:p>
     <w:p>
@@ -22384,7 +23001,7 @@
         <w:pStyle w:val="BodyText"/>
       </w:pPr>
       <w:r>
-        <w:t xml:space="preserve">Williamson, O. E. (1985).</w:t>
+        <w:t xml:space="preserve">Wang, J., Huang, Y., &amp; Hong, H. (2024). Technology concentration and bank risk: Evidence from Chinese commercial banks.</w:t>
       </w:r>
       <w:r>
         <w:t xml:space="preserve"> </w:t>
@@ -22394,10 +23011,10 @@
           <w:iCs/>
           <w:i/>
         </w:rPr>
-        <w:t xml:space="preserve">The economic institutions of capitalism</w:t>
-      </w:r>
-      <w:r>
-        <w:t xml:space="preserve">. Free Press.</w:t>
+        <w:t xml:space="preserve">International Review of Financial Analysis, 91</w:t>
+      </w:r>
+      <w:r>
+        <w:t xml:space="preserve">, 102968.</w:t>
       </w:r>
     </w:p>
     <w:p>
@@ -22405,7 +23022,7 @@
         <w:pStyle w:val="BodyText"/>
       </w:pPr>
       <w:r>
-        <w:t xml:space="preserve">World Bank. (2023).</w:t>
+        <w:t xml:space="preserve">Wernerfelt, B. (1984). A resource-based view of the firm.</w:t>
       </w:r>
       <w:r>
         <w:t xml:space="preserve"> </w:t>
@@ -22415,10 +23032,10 @@
           <w:iCs/>
           <w:i/>
         </w:rPr>
-        <w:t xml:space="preserve">World Bank Enterprise Surveys 2023</w:t>
-      </w:r>
-      <w:r>
-        <w:t xml:space="preserve">. World Bank Group.</w:t>
+        <w:t xml:space="preserve">Strategic Management Journal, 5</w:t>
+      </w:r>
+      <w:r>
+        <w:t xml:space="preserve">(2), 171–180.</w:t>
       </w:r>
     </w:p>
     <w:p>
@@ -22426,7 +23043,7 @@
         <w:pStyle w:val="BodyText"/>
       </w:pPr>
       <w:r>
-        <w:t xml:space="preserve">World Bank. (2024).</w:t>
+        <w:t xml:space="preserve">Williamson, O. E. (1985).</w:t>
       </w:r>
       <w:r>
         <w:t xml:space="preserve"> </w:t>
@@ -22436,10 +23053,10 @@
           <w:iCs/>
           <w:i/>
         </w:rPr>
-        <w:t xml:space="preserve">World development indicators 2024</w:t>
-      </w:r>
-      <w:r>
-        <w:t xml:space="preserve">. World Bank Group.</w:t>
+        <w:t xml:space="preserve">The economic institutions of capitalism</w:t>
+      </w:r>
+      <w:r>
+        <w:t xml:space="preserve">. Free Press.</w:t>
       </w:r>
     </w:p>
     <w:p>
@@ -22447,7 +23064,7 @@
         <w:pStyle w:val="BodyText"/>
       </w:pPr>
       <w:r>
-        <w:t xml:space="preserve">World Bank. (2025a).</w:t>
+        <w:t xml:space="preserve">World Bank. (2023).</w:t>
       </w:r>
       <w:r>
         <w:t xml:space="preserve"> </w:t>
@@ -22457,7 +23074,7 @@
           <w:iCs/>
           <w:i/>
         </w:rPr>
-        <w:t xml:space="preserve">Taking stock, September 2025: Viet Nam economic update, Nurturing Viet Nam’s high-tech talents</w:t>
+        <w:t xml:space="preserve">World Bank Enterprise Surveys 2023</w:t>
       </w:r>
       <w:r>
         <w:t xml:space="preserve">. World Bank Group.</w:t>
@@ -22468,7 +23085,7 @@
         <w:pStyle w:val="BodyText"/>
       </w:pPr>
       <w:r>
-        <w:t xml:space="preserve">World Bank. (2025b).</w:t>
+        <w:t xml:space="preserve">World Bank. (2024).</w:t>
       </w:r>
       <w:r>
         <w:t xml:space="preserve"> </w:t>
@@ -22478,10 +23095,10 @@
           <w:iCs/>
           <w:i/>
         </w:rPr>
-        <w:t xml:space="preserve">World Bank country and lending groups: FY2026</w:t>
-      </w:r>
-      <w:r>
-        <w:t xml:space="preserve">. World Bank Group. https://datahelpdesk.worldbank.org/knowledgebase/articles/906519</w:t>
+        <w:t xml:space="preserve">World development indicators 2024</w:t>
+      </w:r>
+      <w:r>
+        <w:t xml:space="preserve">. World Bank Group.</w:t>
       </w:r>
     </w:p>
     <w:p>
@@ -22489,7 +23106,7 @@
         <w:pStyle w:val="BodyText"/>
       </w:pPr>
       <w:r>
-        <w:t xml:space="preserve">World Bank. (2025c).</w:t>
+        <w:t xml:space="preserve">World Bank. (2025a).</w:t>
       </w:r>
       <w:r>
         <w:t xml:space="preserve"> </w:t>
@@ -22499,7 +23116,7 @@
           <w:iCs/>
           <w:i/>
         </w:rPr>
-        <w:t xml:space="preserve">World Bank Enterprise Surveys 2025</w:t>
+        <w:t xml:space="preserve">Taking stock, September 2025: Viet Nam economic update, Nurturing Viet Nam’s high-tech talents</w:t>
       </w:r>
       <w:r>
         <w:t xml:space="preserve">. World Bank Group.</w:t>
@@ -22510,7 +23127,7 @@
         <w:pStyle w:val="BodyText"/>
       </w:pPr>
       <w:r>
-        <w:t xml:space="preserve">World Bank. (2026).</w:t>
+        <w:t xml:space="preserve">World Bank. (2025b).</w:t>
       </w:r>
       <w:r>
         <w:t xml:space="preserve"> </w:t>
@@ -22520,13 +23137,10 @@
           <w:iCs/>
           <w:i/>
         </w:rPr>
-        <w:t xml:space="preserve">Viet Nam: Data360 economy snapshot</w:t>
-      </w:r>
-      <w:r>
-        <w:t xml:space="preserve"> </w:t>
-      </w:r>
-      <w:r>
-        <w:t xml:space="preserve">(April 2026). World Bank Group.</w:t>
+        <w:t xml:space="preserve">World Bank country and lending groups: FY2026</w:t>
+      </w:r>
+      <w:r>
+        <w:t xml:space="preserve">. World Bank Group. https://datahelpdesk.worldbank.org/knowledgebase/articles/906519</w:t>
       </w:r>
     </w:p>
     <w:p>
@@ -22534,7 +23148,7 @@
         <w:pStyle w:val="BodyText"/>
       </w:pPr>
       <w:r>
-        <w:t xml:space="preserve">Wu, J., Xu, L., &amp; Yang, Z. (2022). Multinationality and performance of emerging economy multinational enterprises: A twenty-year study.</w:t>
+        <w:t xml:space="preserve">World Bank. (2025c).</w:t>
       </w:r>
       <w:r>
         <w:t xml:space="preserve"> </w:t>
@@ -22544,10 +23158,55 @@
           <w:iCs/>
           <w:i/>
         </w:rPr>
+        <w:t xml:space="preserve">World Bank Enterprise Surveys 2025</w:t>
+      </w:r>
+      <w:r>
+        <w:t xml:space="preserve">. World Bank Group.</w:t>
+      </w:r>
+    </w:p>
+    <w:p>
+      <w:pPr>
+        <w:pStyle w:val="BodyText"/>
+      </w:pPr>
+      <w:r>
+        <w:t xml:space="preserve">World Bank. (2026).</w:t>
+      </w:r>
+      <w:r>
+        <w:t xml:space="preserve"> </w:t>
+      </w:r>
+      <w:r>
+        <w:rPr>
+          <w:iCs/>
+          <w:i/>
+        </w:rPr>
+        <w:t xml:space="preserve">Viet Nam: Data360 economy snapshot</w:t>
+      </w:r>
+      <w:r>
+        <w:t xml:space="preserve"> </w:t>
+      </w:r>
+      <w:r>
+        <w:t xml:space="preserve">(April 2026). World Bank Group.</w:t>
+      </w:r>
+    </w:p>
+    <w:p>
+      <w:pPr>
+        <w:pStyle w:val="BodyText"/>
+      </w:pPr>
+      <w:r>
+        <w:t xml:space="preserve">Wu, J., Wood, G., &amp; Khan, Z. (2022). Internationalization and firm performance: Evidence from a meta-analysis.</w:t>
+      </w:r>
+      <w:r>
+        <w:t xml:space="preserve"> </w:t>
+      </w:r>
+      <w:r>
+        <w:rPr>
+          <w:iCs/>
+          <w:i/>
+        </w:rPr>
         <w:t xml:space="preserve">International Business Review, 31</w:t>
       </w:r>
       <w:r>
-        <w:t xml:space="preserve">(5), 102003.</w:t>
+        <w:t xml:space="preserve">(2), 101920.</w:t>
       </w:r>
     </w:p>
     <w:p>
@@ -23242,7 +23901,7 @@
               <w:jc w:val="left"/>
             </w:pPr>
             <w:r>
-              <w:t xml:space="preserve">Chỉ Tier-1 (website nhị phân)</w:t>
+              <w:t xml:space="preserve">Chỉ Bậc 1 (website nhị phân)</w:t>
             </w:r>
           </w:p>
         </w:tc>
@@ -23304,7 +23963,7 @@
               <w:jc w:val="left"/>
             </w:pPr>
             <w:r>
-              <w:t xml:space="preserve">Chỉ Tier-1</w:t>
+              <w:t xml:space="preserve">Chỉ Bậc 1</w:t>
             </w:r>
           </w:p>
         </w:tc>
@@ -23366,7 +24025,7 @@
               <w:jc w:val="left"/>
             </w:pPr>
             <w:r>
-              <w:t xml:space="preserve">Tier-1 + Tier-2 (thanh toán điện tử k33/k38)</w:t>
+              <w:t xml:space="preserve">Bậc 1 + Bậc 2 (thanh toán điện tử k33/k38)</w:t>
             </w:r>
           </w:p>
         </w:tc>
@@ -23406,7 +24065,7 @@
           <w:iCs/>
           <w:i/>
         </w:rPr>
-        <w:t xml:space="preserve">Nghiên cứu sinh: Đỗ Thùy Hương, Trường Đại học Kỹ thuật Công nghệ Vĩnh Long (VLUTE)</w:t>
+        <w:t xml:space="preserve">Nghiên cứu sinh: Đỗ Thùy Hương, Trường Đại học Cần Thơ</w:t>
       </w:r>
       <w:r>
         <w:t xml:space="preserve"> </w:t>

</xml_diff>

<commit_message>
edit(de-AI): restore certified zero-prose-em-dash standard (regression sweep)
Fresh corpus scan found prose em-dashes re-introduced after the 2026-06-14
de-AI certification (Ch3=8, Ch4=14, Ch5=15, CĐ1=2, CĐ2=1 = 40). Restored:
replaced with comma (appositive/parenthetical) or colon (captions); kept table
empty-cell markers, math, en-dashes (Lind–Mehlum, I–P), and the Johanson &
Vahlne (1977) reference title (APA-faithful). English manuscripts already
slop-free. check-consistency.py: 0 issues. Regenerated CTU .tex (monolithic +
per-chapter) and rebuilt the submission bundle (full PDF 185pp + chapters + CĐ).

Co-Authored-By: Claude Opus 4.8 (1M context) <noreply@anthropic.com>
Claude-Session: https://claude.ai/code/session_01Xumaoraa2DLWLXsgJJ62oq
</commit_message>
<xml_diff>
--- a/dist/BO_NOP_HOAN_CHINH_2026-06/2_chuyen_de/CD1_CTU.docx
+++ b/dist/BO_NOP_HOAN_CHINH_2026-06/2_chuyen_de/CD1_CTU.docx
@@ -5173,7 +5173,7 @@
           <wp:inline>
             <wp:extent cx="5753100" cy="2924179"/>
             <wp:effectExtent b="0" l="0" r="0" t="0"/>
-            <wp:docPr descr="Hình 2.3.1.1. Khung phân tích mô tả CĐ1 — tương quan giữa bốn yếu tố và năng suất lao động theo bối cảnh thể chế ICRV (mẫu gộp mô tả 88.869 doanh nghiệp, 50 nền, 2006–2026)." title="" id="34" name="Picture"/>
+            <wp:docPr descr="Hình 2.3.1.1. Khung phân tích mô tả CĐ1: tương quan giữa bốn yếu tố và năng suất lao động theo bối cảnh thể chế ICRV (mẫu gộp mô tả 88.869 doanh nghiệp, 50 nền, 2006–2026)." title="" id="34" name="Picture"/>
             <a:graphic>
               <a:graphicData uri="http://schemas.openxmlformats.org/drawingml/2006/picture">
                 <pic:pic>
@@ -5216,7 +5216,7 @@
         <w:pStyle w:val="ImageCaption"/>
       </w:pPr>
       <w:r>
-        <w:t xml:space="preserve">Hình 2.3.1.1. Khung phân tích mô tả CĐ1 — tương quan giữa bốn yếu tố và năng suất lao động theo bối cảnh thể chế ICRV (mẫu gộp mô tả 88.869 doanh nghiệp, 50 nền, 2006–2026).</w:t>
+        <w:t xml:space="preserve">Hình 2.3.1.1. Khung phân tích mô tả CĐ1: tương quan giữa bốn yếu tố và năng suất lao động theo bối cảnh thể chế ICRV (mẫu gộp mô tả 88.869 doanh nghiệp, 50 nền, 2006–2026).</w:t>
       </w:r>
     </w:p>
     <w:p>
@@ -23278,7 +23278,7 @@
           <w:iCs/>
           <w:i/>
         </w:rPr>
-        <w:t xml:space="preserve">Phân bổ 50 nền kinh tế theo nhóm ICRV — khung mô tả LP-valid tái lập 84.998 doanh nghiệp, 107 cặp nền kinh tế × năm, 2006–2026 (cột n đã gồm China-2012 và đủ bốn đợt Azerbaijan).</w:t>
+        <w:t xml:space="preserve">Phân bổ 50 nền kinh tế theo nhóm ICRV: khung mô tả LP-valid tái lập 84.998 doanh nghiệp, 107 cặp nền kinh tế × năm, 2006–2026 (cột n đã gồm China-2012 và đủ bốn đợt Azerbaijan).</w:t>
       </w:r>
     </w:p>
     <w:tbl>

</xml_diff>